<commit_message>
Padroniza a escrita da parte nova com o estilo do grupo
Reescreve complementos, Parte 3 e fechamento em tom formal e claro, na
voz do grupo (primeira pessoa do plural), sem frases de bastidor, com
glossário único para termos técnicos e termos em inglês em itálico, como
nas Partes 1 e 2. Números, nomes, citações e rótulos de valores
fictícios foram preservados; as Partes 1 e 2 continuam intactas.

Co-Authored-By: Claude Opus 5.5 <noreply@anthropic.com>
Claude-Session: https://claude.ai/code/session_01BVfLaRRKzm2R3n6NVVxmAf
</commit_message>
<xml_diff>
--- a/entregas/Red_Bull_Plano_CIM_Partes_1_a_3.docx
+++ b/entregas/Red_Bull_Plano_CIM_Partes_1_a_3.docx
@@ -3552,7 +3552,7 @@
           <w:sz w:val="24"/>
           <w:szCs w:val="24"/>
         </w:rPr>
-        <w:t xml:space="preserve">Este bloco acrescenta os elementos da estrutura final do plano que ainda não estavam explícitos nas Partes 1 e 2. O texto anterior foi mantido sem alterações. Cada complemento parte do que o grupo já definiu: problema, tensão, público prioritário, objetivo, posicionamento, mensagem central e jornada. Os complementos A a E detalham itens já existentes; a seção 8 (big idea) é um item novo da estrutura final. O Quadro 1 mostra onde cada um dos 14 itens da estrutura final se encontra neste documento.</w:t>
+        <w:t xml:space="preserve">Nesta parte, completamos os pontos da estrutura final do plano que ainda não estavam explícitos nas Partes 1 e 2. Cada complemento parte do que já tínhamos definido: o problema, a tensão, o público prioritário, o objetivo, o posicionamento, a mensagem central e a jornada. Os complementos A a E detalham itens que já existiam, enquanto a seção 8 (big idea) é um item novo da estrutura final. O Quadro 1 mostra onde cada um dos 14 itens da estrutura final se encontra neste documento.</w:t>
       </w:r>
     </w:p>
     <w:p>
@@ -4173,7 +4173,7 @@
                 <w:sz w:val="20"/>
                 <w:szCs w:val="20"/>
               </w:rPr>
-              <w:t xml:space="preserve">Resposta “O objetivo responde ao problema de comunicação?”; complemento B (proposta de redação)</w:t>
+              <w:t xml:space="preserve">Resposta “O objetivo responde ao problema de comunicação?”; complemento B (objetivo na fórmula vista em aula)</w:t>
             </w:r>
           </w:p>
         </w:tc>
@@ -4335,7 +4335,7 @@
                 <w:sz w:val="20"/>
                 <w:szCs w:val="20"/>
               </w:rPr>
-              <w:t xml:space="preserve">Seção 8, ao final deste bloco</w:t>
+              <w:t xml:space="preserve">Seção 8, ao final dos complementos</w:t>
             </w:r>
           </w:p>
         </w:tc>
@@ -4882,20 +4882,10 @@
       <w:r>
         <w:rPr>
           <w:rFonts w:ascii="Times New Roman" w:cs="Times New Roman" w:eastAsia="Times New Roman" w:hAnsi="Times New Roman"/>
-          <w:b w:val="1"/>
-          <w:bCs w:val="1"/>
-          <w:sz w:val="24"/>
-          <w:szCs w:val="24"/>
-        </w:rPr>
-        <w:t xml:space="preserve">Tensão já registrada (seção 3):</w:t>
-      </w:r>
-      <w:r>
-        <w:rPr>
-          <w:rFonts w:ascii="Times New Roman" w:cs="Times New Roman" w:eastAsia="Times New Roman" w:hAnsi="Times New Roman"/>
-          <w:sz w:val="24"/>
-          <w:szCs w:val="24"/>
-        </w:rPr>
-        <w:t xml:space="preserve"> o foco histórico em esportes radicais afasta consumidores funcionais que buscam foco e bem-estar, sem a estética agitada associada à marca.</w:t>
+          <w:sz w:val="24"/>
+          <w:szCs w:val="24"/>
+        </w:rPr>
+        <w:t xml:space="preserve">A tensão que registramos na seção 3 é que o foco histórico em esportes radicais afasta os consumidores funcionais, que buscam foco e bem-estar sem a estética agitada associada à marca.</w:t>
       </w:r>
     </w:p>
     <w:p>
@@ -4953,20 +4943,10 @@
       <w:r>
         <w:rPr>
           <w:rFonts w:ascii="Times New Roman" w:cs="Times New Roman" w:eastAsia="Times New Roman" w:hAnsi="Times New Roman"/>
-          <w:b w:val="1"/>
-          <w:bCs w:val="1"/>
-          <w:sz w:val="24"/>
-          <w:szCs w:val="24"/>
-        </w:rPr>
-        <w:t xml:space="preserve">Leitura estratégica:</w:t>
-      </w:r>
-      <w:r>
-        <w:rPr>
-          <w:rFonts w:ascii="Times New Roman" w:cs="Times New Roman" w:eastAsia="Times New Roman" w:hAnsi="Times New Roman"/>
-          <w:sz w:val="24"/>
-          <w:szCs w:val="24"/>
-        </w:rPr>
-        <w:t xml:space="preserve"> para esse público, o alto rendimento é cotidiano e silencioso. A marca costuma mostrar a conquista espetacular (o salto, a corrida), enquanto o público vive conquistas que ninguém vê (o capítulo concluído, o código que roda, o prazo cumprido). Essa distância explica a percepção de que o produto é voltado a festas ou atividades radicais, registrada na Parte 2, e aponta o caminho da comunicação: dar visibilidade e valor às conquistas diárias.</w:t>
+          <w:sz w:val="24"/>
+          <w:szCs w:val="24"/>
+        </w:rPr>
+        <w:t xml:space="preserve">Na nossa leitura, para esse público, o alto rendimento faz parte do cotidiano e acontece em silêncio. A marca costuma mostrar a conquista espetacular, como o salto ou a corrida, enquanto o público vive conquistas que ninguém vê, como o capítulo concluído, o código que roda ou o prazo cumprido. Essa distância explica a percepção, registrada na Parte 2, de que o produto é voltado para festas ou atividades radicais. Por isso, o caminho da comunicação é dar visibilidade e valor às conquistas diárias.</w:t>
       </w:r>
     </w:p>
     <w:p>
@@ -4981,20 +4961,10 @@
       <w:r>
         <w:rPr>
           <w:rFonts w:ascii="Times New Roman" w:cs="Times New Roman" w:eastAsia="Times New Roman" w:hAnsi="Times New Roman"/>
-          <w:b w:val="1"/>
-          <w:bCs w:val="1"/>
-          <w:sz w:val="24"/>
-          <w:szCs w:val="24"/>
-        </w:rPr>
-        <w:t xml:space="preserve">Contexto que sustenta a escolha:</w:t>
-      </w:r>
-      <w:r>
-        <w:rPr>
-          <w:rFonts w:ascii="Times New Roman" w:cs="Times New Roman" w:eastAsia="Times New Roman" w:hAnsi="Times New Roman"/>
-          <w:sz w:val="24"/>
-          <w:szCs w:val="24"/>
-        </w:rPr>
-        <w:t xml:space="preserve"> no 4º trimestre de 2022, 9,5 milhões de pessoas trabalhavam de forma remota no Brasil (IBGE apud PODER360, 2023). Em 2024, o ensino superior somou 10,2 milhões de matrículas e, pela primeira vez, a maioria delas (50,75%) estava em cursos a distância (INEP apud AGÊNCIA BRASIL, 2025). Boa parte do público prioritário estuda e trabalha em casa, o que aumenta o peso dos canais digitais e dos aplicativos de entrega.</w:t>
+          <w:sz w:val="24"/>
+          <w:szCs w:val="24"/>
+        </w:rPr>
+        <w:t xml:space="preserve">Alguns dados do contexto brasileiro sustentam essa escolha. No 4º trimestre de 2022, 9,5 milhões de pessoas trabalhavam de forma remota no Brasil (IBGE apud PODER360, 2023). Em 2024, o ensino superior somou 10,2 milhões de matrículas e, pela primeira vez, a maioria delas (50,75%) estava em cursos a distância (INEP apud AGÊNCIA BRASIL, 2025). Esses números indicam que boa parte do público prioritário estuda e trabalha em casa, o que aumenta o peso dos canais digitais e dos aplicativos de entrega.</w:t>
       </w:r>
     </w:p>
     <w:p>
@@ -5009,20 +4979,10 @@
       <w:r>
         <w:rPr>
           <w:rFonts w:ascii="Times New Roman" w:cs="Times New Roman" w:eastAsia="Times New Roman" w:hAnsi="Times New Roman"/>
-          <w:b w:val="1"/>
-          <w:bCs w:val="1"/>
-          <w:sz w:val="24"/>
-          <w:szCs w:val="24"/>
-        </w:rPr>
-        <w:t xml:space="preserve">Status:</w:t>
-      </w:r>
-      <w:r>
-        <w:rPr>
-          <w:rFonts w:ascii="Times New Roman" w:cs="Times New Roman" w:eastAsia="Times New Roman" w:hAnsi="Times New Roman"/>
-          <w:sz w:val="24"/>
-          <w:szCs w:val="24"/>
-        </w:rPr>
-        <w:t xml:space="preserve"> o insight é uma formulação do grupo a partir da tensão descrita na seção 3. Ele será testado na pesquisa de linha de base (seção 13), antes do lançamento da campanha.</w:t>
+          <w:sz w:val="24"/>
+          <w:szCs w:val="24"/>
+        </w:rPr>
+        <w:t xml:space="preserve">Por enquanto, esse insight é uma formulação nossa, feita a partir da tensão descrita na seção 3. Ele será testado na pesquisa de linha de base (seção 13), antes do lançamento da campanha.</w:t>
       </w:r>
     </w:p>
     <w:p>
@@ -5045,7 +5005,7 @@
           <w:sz w:val="24"/>
           <w:szCs w:val="24"/>
         </w:rPr>
-        <w:t xml:space="preserve">B. Objetivo de comunicação: proposta de redação (complemento ao item 6)</w:t>
+        <w:t xml:space="preserve">B. Objetivo de comunicação na fórmula vista em aula (complemento ao item 6)</w:t>
       </w:r>
     </w:p>
     <w:p>
@@ -5063,17 +5023,7 @@
           <w:sz w:val="24"/>
           <w:szCs w:val="24"/>
         </w:rPr>
-        <w:t xml:space="preserve">A redação atual da Parte 2 foi mantida. A proposta abaixo aplica a fórmula vista em aula, [verbo] + [público] + [mudança comunicacional] + [horizonte] (SOUZA, 2026b), sem mudar o sentido original. </w:t>
-      </w:r>
-      <w:r>
-        <w:rPr>
-          <w:rFonts w:ascii="Times New Roman" w:cs="Times New Roman" w:eastAsia="Times New Roman" w:hAnsi="Times New Roman"/>
-          <w:b w:val="1"/>
-          <w:bCs w:val="1"/>
-          <w:sz w:val="24"/>
-          <w:szCs w:val="24"/>
-        </w:rPr>
-        <w:t xml:space="preserve">Cabe ao grupo decidir se ela substitui a redação atual.</w:t>
+        <w:t xml:space="preserve">Reescrevemos o objetivo da Parte 2 seguindo a fórmula vista em aula, que é [verbo] + [público] + [mudança comunicacional] + [horizonte] (SOUZA, 2026b), para deixá-lo mensurável sem mudar o sentido original.</w:t>
       </w:r>
     </w:p>
     <w:p>
@@ -5763,7 +5713,7 @@
           <w:sz w:val="24"/>
           <w:szCs w:val="24"/>
         </w:rPr>
-        <w:t xml:space="preserve">“Para universitários, trabalhadores remotos e profissionais do conhecimento de 18 a 35 anos em rotinas intensas, a Red Bull é o combustível de performance intelectual e criativa que entrega energia para os momentos de foco que constroem as conquistas do dia, porque oferece uma fórmula padronizada e pronta para consumo (80 mg de cafeína por lata de 250 ml, taurina e vitaminas do complexo B, com versões sem açúcar), está disponível onde a rotina acontece e carrega décadas de associação com a superação de limites.”</w:t>
+        <w:t xml:space="preserve">“Para universitários, trabalhadores remotos e profissionais do conhecimento de 18 a 35 anos em rotinas intensas, a Red Bull é o combustível de performance intelectual e criativa que entrega energia para os momentos de foco que constroem as conquistas do dia, porque oferece uma fórmula padronizada e pronta para consumo (80 mg de cafeína por lata de 250 ml, taurina e vitaminas do complexo B, com versões sem açúcar), está disponível onde a rotina acontece e é associada há décadas à superação de limites.”</w:t>
       </w:r>
     </w:p>
     <w:p>
@@ -5778,38 +5728,10 @@
       <w:r>
         <w:rPr>
           <w:rFonts w:ascii="Times New Roman" w:cs="Times New Roman" w:eastAsia="Times New Roman" w:hAnsi="Times New Roman"/>
-          <w:b w:val="1"/>
-          <w:bCs w:val="1"/>
-          <w:sz w:val="24"/>
-          <w:szCs w:val="24"/>
-        </w:rPr>
-        <w:t xml:space="preserve">Alternativas reais (Parte 2):</w:t>
-      </w:r>
-      <w:r>
-        <w:rPr>
-          <w:rFonts w:ascii="Times New Roman" w:cs="Times New Roman" w:eastAsia="Times New Roman" w:hAnsi="Times New Roman"/>
-          <w:sz w:val="24"/>
-          <w:szCs w:val="24"/>
-        </w:rPr>
-        <w:t xml:space="preserve"> cafés especiais (como o SuperCoffee), suplementos, pré-treinos e energéticos de baixo custo. </w:t>
-      </w:r>
-      <w:r>
-        <w:rPr>
-          <w:rFonts w:ascii="Times New Roman" w:cs="Times New Roman" w:eastAsia="Times New Roman" w:hAnsi="Times New Roman"/>
-          <w:b w:val="1"/>
-          <w:bCs w:val="1"/>
-          <w:sz w:val="24"/>
-          <w:szCs w:val="24"/>
-        </w:rPr>
-        <w:t xml:space="preserve">Diferença defendida:</w:t>
-      </w:r>
-      <w:r>
-        <w:rPr>
-          <w:rFonts w:ascii="Times New Roman" w:cs="Times New Roman" w:eastAsia="Times New Roman" w:hAnsi="Times New Roman"/>
-          <w:sz w:val="24"/>
-          <w:szCs w:val="24"/>
-        </w:rPr>
-        <w:t xml:space="preserve"> conveniência e consistência (sempre igual, gelada e pronta), somadas ao significado da marca (quem supera os próprios limites). A frase orienta a equipe e não é texto para o consumidor (SOUZA, 2026b).</w:t>
+          <w:sz w:val="24"/>
+          <w:szCs w:val="24"/>
+        </w:rPr>
+        <w:t xml:space="preserve">Como apontamos na Parte 2, as alternativas reais à Red Bull são os cafés especiais (como o SuperCoffee), os suplementos, os pré-treinos e os energéticos de baixo custo. A diferença que defendemos em relação a elas é a conveniência e a consistência da lata, que está sempre igual, gelada e pronta, somadas ao significado da marca, ligado a quem supera os próprios limites. Vale lembrar que a declaração de posicionamento é um texto de uso interno, que orienta a equipe, e não uma mensagem para o consumidor (SOUZA, 2026b).</w:t>
       </w:r>
     </w:p>
     <w:p>
@@ -5850,7 +5772,7 @@
           <w:sz w:val="24"/>
           <w:szCs w:val="24"/>
         </w:rPr>
-        <w:t xml:space="preserve">A hierarquia de mensagens organiza uma ideia central e três provas que a sustentam (SOUZA, 2026b).</w:t>
+        <w:t xml:space="preserve">Para organizar a mensagem, usamos a hierarquia de mensagens, que reúne uma ideia central e três provas que a sustentam (SOUZA, 2026b).</w:t>
       </w:r>
     </w:p>
     <w:p>
@@ -6547,7 +6469,7 @@
           <w:sz w:val="24"/>
           <w:szCs w:val="24"/>
         </w:rPr>
-        <w:t xml:space="preserve"> a estratégia terá feito sentido se, ao fim dos três meses, (1) o público prioritário exposto à campanha associar a Red Bull a “foco para estudar e trabalhar” mais do que o público não exposto, com diferença estatisticamente significativa; (2) essa mudança aparecer também em comportamento, com mais consideração e mais compras nas ocasiões de foco; e (3) a associação com “superar limites” não cair, o que mostra que a essência da marca foi preservada. As metas numéricas estão na seção 13.</w:t>
+        <w:t xml:space="preserve"> consideramos que a estratégia terá dado certo se, ao fim dos três meses, três condições forem atendidas. Primeiro, o público prioritário exposto à campanha deve associar a Red Bull a “foco para estudar e trabalhar” mais do que o público não exposto, com diferença estatisticamente significativa. Segundo, essa mudança deve aparecer também no comportamento, com mais consideração e mais compras nas ocasiões de foco. Terceiro, a associação com “superar limites” não pode cair, o que mostra que a essência da marca foi preservada. As metas numéricas estão na seção 13.</w:t>
       </w:r>
     </w:p>
     <w:p>
@@ -6588,7 +6510,7 @@
           <w:sz w:val="24"/>
           <w:szCs w:val="24"/>
         </w:rPr>
-        <w:t xml:space="preserve">A matriz parte das etapas da tabela de jornada (seção 5) e indica, para cada uma, a barreira do público prioritário, a tarefa da comunicação e os canais escolhidos pela função que cumprem. Os pontos de contato atuais (esportes radicais, Fórmula 1 e eSports) continuam e preservam a essência da marca; a campanha acrescenta a narrativa das conquistas diárias, muitas vezes nas mesmas plataformas.</w:t>
+        <w:t xml:space="preserve">Montamos a matriz a partir das etapas da tabela de jornada (seção 5). Para cada etapa, indicamos a barreira do público prioritário, a tarefa da comunicação e os canais escolhidos de acordo com a função que cumprem. Os pontos de contato atuais (esportes radicais, Fórmula 1 e eSports) continuam e preservam a essência da marca, e a campanha acrescenta a eles a narrativa das conquistas diárias, muitas vezes nas mesmas plataformas.</w:t>
       </w:r>
     </w:p>
     <w:p>
@@ -7113,7 +7035,25 @@
                 <w:sz w:val="20"/>
                 <w:szCs w:val="20"/>
               </w:rPr>
-              <w:t xml:space="preserve">Hub Modo Foco, carrosséis e remarketing (explicar); depoimentos, UGC e imprensa (provar); geladeira e comunicação funcional no PDV, já previstas na Parte 2</w:t>
+              <w:t xml:space="preserve">Hub Modo Foco, carrosséis e </w:t>
+            </w:r>
+            <w:r>
+              <w:rPr>
+                <w:rFonts w:ascii="Times New Roman" w:cs="Times New Roman" w:eastAsia="Times New Roman" w:hAnsi="Times New Roman"/>
+                <w:i w:val="1"/>
+                <w:iCs w:val="1"/>
+                <w:sz w:val="20"/>
+                <w:szCs w:val="20"/>
+              </w:rPr>
+              <w:t xml:space="preserve">remarketing</w:t>
+            </w:r>
+            <w:r>
+              <w:rPr>
+                <w:rFonts w:ascii="Times New Roman" w:cs="Times New Roman" w:eastAsia="Times New Roman" w:hAnsi="Times New Roman"/>
+                <w:sz w:val="20"/>
+                <w:szCs w:val="20"/>
+              </w:rPr>
+              <w:t xml:space="preserve"> (explicar); depoimentos, UGC e imprensa (provar); geladeira e comunicação funcional no PDV, já previstas na Parte 2</w:t>
             </w:r>
           </w:p>
         </w:tc>
@@ -7266,7 +7206,25 @@
                 <w:sz w:val="20"/>
                 <w:szCs w:val="20"/>
               </w:rPr>
-              <w:t xml:space="preserve">PDV próximo a universidades e coworkings; combo “Momento de Foco/Estudo” no iFood e no Rappi; amostragem com cupom (converter)</w:t>
+              <w:t xml:space="preserve">PDV próximo a universidades e </w:t>
+            </w:r>
+            <w:r>
+              <w:rPr>
+                <w:rFonts w:ascii="Times New Roman" w:cs="Times New Roman" w:eastAsia="Times New Roman" w:hAnsi="Times New Roman"/>
+                <w:i w:val="1"/>
+                <w:iCs w:val="1"/>
+                <w:sz w:val="20"/>
+                <w:szCs w:val="20"/>
+              </w:rPr>
+              <w:t xml:space="preserve">coworkings</w:t>
+            </w:r>
+            <w:r>
+              <w:rPr>
+                <w:rFonts w:ascii="Times New Roman" w:cs="Times New Roman" w:eastAsia="Times New Roman" w:hAnsi="Times New Roman"/>
+                <w:sz w:val="20"/>
+                <w:szCs w:val="20"/>
+              </w:rPr>
+              <w:t xml:space="preserve">; combo “Momento de Foco/Estudo” no iFood e no Rappi; amostragem com cupom (converter)</w:t>
             </w:r>
           </w:p>
         </w:tc>
@@ -7419,7 +7377,25 @@
                 <w:sz w:val="20"/>
                 <w:szCs w:val="20"/>
               </w:rPr>
-              <w:t xml:space="preserve">Ativação Pausa com Asas; cartão e QR do combo com rotina de foco; playlist Modo Foco (provar e explicar)</w:t>
+              <w:t xml:space="preserve">Ativação Pausa com Asas; cartão e QR do combo com rotina de foco; </w:t>
+            </w:r>
+            <w:r>
+              <w:rPr>
+                <w:rFonts w:ascii="Times New Roman" w:cs="Times New Roman" w:eastAsia="Times New Roman" w:hAnsi="Times New Roman"/>
+                <w:i w:val="1"/>
+                <w:iCs w:val="1"/>
+                <w:sz w:val="20"/>
+                <w:szCs w:val="20"/>
+              </w:rPr>
+              <w:t xml:space="preserve">playlist</w:t>
+            </w:r>
+            <w:r>
+              <w:rPr>
+                <w:rFonts w:ascii="Times New Roman" w:cs="Times New Roman" w:eastAsia="Times New Roman" w:hAnsi="Times New Roman"/>
+                <w:sz w:val="20"/>
+                <w:szCs w:val="20"/>
+              </w:rPr>
+              <w:t xml:space="preserve"> Modo Foco (provar e explicar)</w:t>
             </w:r>
           </w:p>
         </w:tc>
@@ -7659,7 +7635,7 @@
           <w:sz w:val="24"/>
           <w:szCs w:val="24"/>
         </w:rPr>
-        <w:t xml:space="preserve">A Red Bull passa a narrar as conquistas cotidianas do público (a prova, a entrega, o projeto) com a mesma linguagem épica que usa para os voos de seus atletas. A conquista que ninguém vê ganha câmera lenta, cronômetro, telemetria e narração de transmissão esportiva. A lata aparece no momento de foco que antecede o “pouso”, isto é, a conquista concluída.</w:t>
+        <w:t xml:space="preserve">A ideia é que a Red Bull passe a narrar as conquistas cotidianas do público, como a prova, a entrega e o projeto, com a mesma linguagem épica que usa para os voos de seus atletas. Dessa forma, a conquista que ninguém vê ganha câmera lenta, cronômetro, telemetria e narração de transmissão esportiva. A lata aparece no momento de foco que vem antes do “pouso”, ou seja, antes da conquista concluída.</w:t>
       </w:r>
     </w:p>
     <w:p>
@@ -8199,7 +8175,7 @@
                 <w:sz w:val="20"/>
                 <w:szCs w:val="20"/>
               </w:rPr>
-              <w:t xml:space="preserve">Define um mecanismo criativo replicável (a linguagem de transmissão esportiva aplicada ao cotidiano) que gera todas as ações. Mantém a estética de performance da marca e muda o território, do radical para o diário.</w:t>
+              <w:t xml:space="preserve">Define uma linha criativa replicável (a linguagem de transmissão esportiva aplicada ao cotidiano) que dá origem a todas as ações. Mantém a estética de performance da marca, mas muda o contexto, do radical para o diário.</w:t>
             </w:r>
           </w:p>
         </w:tc>
@@ -8345,7 +8321,7 @@
           <w:sz w:val="24"/>
           <w:szCs w:val="24"/>
         </w:rPr>
-        <w:t xml:space="preserve">A Parte 3 transforma a arquitetura das Partes 1 e 2 em ações coordenadas, com sequência, responsáveis, recursos e indicadores. As premissas abaixo valem para todas as seções seguintes e evitam que dados indisponíveis sejam apresentados como reais.</w:t>
+        <w:t xml:space="preserve">Na Parte 3, transformamos o que foi definido nas Partes 1 e 2 em ações coordenadas, com sequência, responsáveis, recursos e indicadores. As premissas abaixo valem para todas as seções seguintes e servem para evitar que dados indisponíveis sejam apresentados como reais.</w:t>
       </w:r>
     </w:p>
     <w:p>
@@ -8642,7 +8618,7 @@
                 <w:sz w:val="20"/>
                 <w:szCs w:val="20"/>
               </w:rPr>
-              <w:t xml:space="preserve">13 semanas (três meses). Sugere-se que a onda Lançar coincida com o início de um semestre letivo e a onda Converter, com o período de provas e entregas. As datas variam por instituição.</w:t>
+              <w:t xml:space="preserve">13 semanas (três meses). O ideal é que a onda Lançar coincida com o início de um semestre letivo e a onda Converter, com o período de provas e entregas. As datas variam por instituição.</w:t>
             </w:r>
           </w:p>
         </w:tc>
@@ -8723,7 +8699,25 @@
                 <w:sz w:val="20"/>
                 <w:szCs w:val="20"/>
               </w:rPr>
-              <w:t xml:space="preserve">Ações digitais em todo o país. Ações presenciais (campus, coworkings e PDV) em cinco praças-piloto: São Paulo, Rio de Janeiro, Belo Horizonte, Brasília e Cuiabá. As quatro primeiras concentram universitários e profissionais do conhecimento; Cuiabá, capital de porte médio, testa se o resultado se repete fora dos grandes centros (premissa do grupo).</w:t>
+              <w:t xml:space="preserve">Ações digitais em todo o país. Ações presenciais (campus, </w:t>
+            </w:r>
+            <w:r>
+              <w:rPr>
+                <w:rFonts w:ascii="Times New Roman" w:cs="Times New Roman" w:eastAsia="Times New Roman" w:hAnsi="Times New Roman"/>
+                <w:i w:val="1"/>
+                <w:iCs w:val="1"/>
+                <w:sz w:val="20"/>
+                <w:szCs w:val="20"/>
+              </w:rPr>
+              <w:t xml:space="preserve">coworkings</w:t>
+            </w:r>
+            <w:r>
+              <w:rPr>
+                <w:rFonts w:ascii="Times New Roman" w:cs="Times New Roman" w:eastAsia="Times New Roman" w:hAnsi="Times New Roman"/>
+                <w:sz w:val="20"/>
+                <w:szCs w:val="20"/>
+              </w:rPr>
+              <w:t xml:space="preserve"> e PDV) em cinco cidades-piloto: São Paulo, Rio de Janeiro, Belo Horizonte, Brasília e Cuiabá. As quatro primeiras concentram universitários e profissionais do conhecimento. Cuiabá, capital de porte médio, testa se o resultado se repete fora dos grandes centros (premissa do grupo).</w:t>
             </w:r>
           </w:p>
         </w:tc>
@@ -9111,7 +9105,7 @@
           <w:sz w:val="24"/>
           <w:szCs w:val="24"/>
         </w:rPr>
-        <w:t xml:space="preserve">Na Parte 2, o grupo escolheu os canais pela função que cumprem na jornada. Aqui essa escolha vira um ecossistema: cada ponto de contato tem um papel (atrair, explicar, provar, converter, relacionar ou reativar), um tipo de mídia (paga, própria, conquistada ou experiência) e uma justificativa ligada ao público e à etapa. Todos repetem a mesma mensagem central e a mesma big idea, o que garante a integração (Figura 1).</w:t>
+        <w:t xml:space="preserve">Na Parte 2, escolhemos os canais de acordo com a função que cada um cumpre na jornada. Nesta seção, essa escolha é organizada como um ecossistema, em que cada ponto de contato tem um papel (atrair, explicar, provar, converter, relacionar ou reativar), um tipo de mídia (paga, própria, conquistada ou experiência) e uma justificativa ligada ao público e à etapa da jornada. Todos os canais repetem a mesma mensagem central e a mesma big idea, o que garante a integração da comunicação (Figura 1).</w:t>
       </w:r>
     </w:p>
     <w:p>
@@ -9886,7 +9880,29 @@
                 <w:sz w:val="20"/>
                 <w:szCs w:val="20"/>
               </w:rPr>
-              <w:t xml:space="preserve">Hub Modo Foco (página no site e playlist de foco)</w:t>
+              <w:t xml:space="preserve">Hub Modo Foco (página no site e </w:t>
+            </w:r>
+            <w:r>
+              <w:rPr>
+                <w:rFonts w:ascii="Times New Roman" w:cs="Times New Roman" w:eastAsia="Times New Roman" w:hAnsi="Times New Roman"/>
+                <w:b w:val="1"/>
+                <w:bCs w:val="1"/>
+                <w:i w:val="1"/>
+                <w:iCs w:val="1"/>
+                <w:sz w:val="20"/>
+                <w:szCs w:val="20"/>
+              </w:rPr>
+              <w:t xml:space="preserve">playlist</w:t>
+            </w:r>
+            <w:r>
+              <w:rPr>
+                <w:rFonts w:ascii="Times New Roman" w:cs="Times New Roman" w:eastAsia="Times New Roman" w:hAnsi="Times New Roman"/>
+                <w:b w:val="1"/>
+                <w:bCs w:val="1"/>
+                <w:sz w:val="20"/>
+                <w:szCs w:val="20"/>
+              </w:rPr>
+              <w:t xml:space="preserve"> de foco)</w:t>
             </w:r>
           </w:p>
         </w:tc>
@@ -10072,10 +10088,22 @@
                 <w:rFonts w:ascii="Times New Roman" w:cs="Times New Roman" w:eastAsia="Times New Roman" w:hAnsi="Times New Roman"/>
                 <w:b w:val="1"/>
                 <w:bCs w:val="1"/>
-                <w:sz w:val="20"/>
-                <w:szCs w:val="20"/>
-              </w:rPr>
-              <w:t xml:space="preserve">Remarketing (Meta, TikTok e Google)</w:t>
+                <w:i w:val="1"/>
+                <w:iCs w:val="1"/>
+                <w:sz w:val="20"/>
+                <w:szCs w:val="20"/>
+              </w:rPr>
+              <w:t xml:space="preserve">Remarketing</w:t>
+            </w:r>
+            <w:r>
+              <w:rPr>
+                <w:rFonts w:ascii="Times New Roman" w:cs="Times New Roman" w:eastAsia="Times New Roman" w:hAnsi="Times New Roman"/>
+                <w:b w:val="1"/>
+                <w:bCs w:val="1"/>
+                <w:sz w:val="20"/>
+                <w:szCs w:val="20"/>
+              </w:rPr>
+              <w:t xml:space="preserve"> (Meta, TikTok e Google)</w:t>
             </w:r>
           </w:p>
         </w:tc>
@@ -10453,7 +10481,29 @@
                 <w:sz w:val="20"/>
                 <w:szCs w:val="20"/>
               </w:rPr>
-              <w:t xml:space="preserve">Ativação Pausa com Asas (campus, bibliotecas e coworkings)</w:t>
+              <w:t xml:space="preserve">Ativação Pausa com Asas (campus, bibliotecas e </w:t>
+            </w:r>
+            <w:r>
+              <w:rPr>
+                <w:rFonts w:ascii="Times New Roman" w:cs="Times New Roman" w:eastAsia="Times New Roman" w:hAnsi="Times New Roman"/>
+                <w:b w:val="1"/>
+                <w:bCs w:val="1"/>
+                <w:i w:val="1"/>
+                <w:iCs w:val="1"/>
+                <w:sz w:val="20"/>
+                <w:szCs w:val="20"/>
+              </w:rPr>
+              <w:t xml:space="preserve">coworkings</w:t>
+            </w:r>
+            <w:r>
+              <w:rPr>
+                <w:rFonts w:ascii="Times New Roman" w:cs="Times New Roman" w:eastAsia="Times New Roman" w:hAnsi="Times New Roman"/>
+                <w:b w:val="1"/>
+                <w:bCs w:val="1"/>
+                <w:sz w:val="20"/>
+                <w:szCs w:val="20"/>
+              </w:rPr>
+              <w:t xml:space="preserve">)</w:t>
             </w:r>
           </w:p>
         </w:tc>
@@ -11205,20 +11255,10 @@
       <w:r>
         <w:rPr>
           <w:rFonts w:ascii="Times New Roman" w:cs="Times New Roman" w:eastAsia="Times New Roman" w:hAnsi="Times New Roman"/>
-          <w:b w:val="1"/>
-          <w:bCs w:val="1"/>
-          <w:sz w:val="24"/>
-          <w:szCs w:val="24"/>
-        </w:rPr>
-        <w:t xml:space="preserve">Sequência de contato pretendida:</w:t>
-      </w:r>
-      <w:r>
-        <w:rPr>
-          <w:rFonts w:ascii="Times New Roman" w:cs="Times New Roman" w:eastAsia="Times New Roman" w:hAnsi="Times New Roman"/>
-          <w:sz w:val="24"/>
-          <w:szCs w:val="24"/>
-        </w:rPr>
-        <w:t xml:space="preserve"> a pessoa assiste a uma “transmissão” de conquista diária (atrair). Depois, é impactada pelo Hub e pelas provas (explicar e provar). Em seguida, experimenta numa ativação ou encontra a geladeira e o combo (converter). Por fim, entra no Diário de Bordo e recebe lembretes antes das semanas de provas (relacionar e reativar). Os canais não disputam o mesmo papel: cada um entrega o público ao seguinte.</w:t>
+          <w:sz w:val="24"/>
+          <w:szCs w:val="24"/>
+        </w:rPr>
+        <w:t xml:space="preserve">A sequência de contato que planejamos funciona assim. Primeiro, a pessoa assiste a uma “transmissão” de conquista diária (atrair). Depois, é impactada pelo Hub e pelas provas (explicar e provar). Em seguida, experimenta o produto numa ativação ou encontra a geladeira e o combo (converter). Por fim, entra no Diário de Bordo e recebe lembretes antes das semanas de provas (relacionar e reativar). Dessa forma, os canais não disputam o mesmo papel, já que cada um encaminha o público para o próximo.</w:t>
       </w:r>
     </w:p>
     <w:p>
@@ -11246,7 +11286,7 @@
           <w:sz w:val="24"/>
           <w:szCs w:val="24"/>
         </w:rPr>
-        <w:t xml:space="preserve"> TV aberta e mídia exterior nacional. Têm custo alto, segmentação fraca para um público específico e são difíceis de medir em um piloto de três meses.</w:t>
+        <w:t xml:space="preserve"> optamos por não usar TV aberta e mídia exterior nacional, pois têm custo alto, segmentação fraca para um público específico e são difíceis de medir em um piloto de três meses.</w:t>
       </w:r>
     </w:p>
     <w:p>
@@ -11287,7 +11327,7 @@
           <w:sz w:val="24"/>
           <w:szCs w:val="24"/>
         </w:rPr>
-        <w:t xml:space="preserve">As ações seguem a ordem recomendada em aula: primeiro os pilares de conteúdo, depois a direção criativa e só então os formatos (SOUZA, 2026c). São sete ações (A1 a A7). Cada uma tem função, promessa, comportamento esperado, sequência de contato, critério de sucesso e indicador (Quadro 10 e Quadro 11).</w:t>
+        <w:t xml:space="preserve">Para montar o plano de ações, seguimos a ordem recomendada em aula, definindo primeiro os pilares de conteúdo, depois a direção criativa e só então os formatos (SOUZA, 2026c). Dessa forma, chegamos a sete ações (A1 a A7), e cada uma delas tem função, promessa, comportamento esperado, sequência de contato, critério de sucesso e indicador, como mostram o Quadro 10 e o Quadro 11.</w:t>
       </w:r>
     </w:p>
     <w:p>
@@ -12120,7 +12160,25 @@
                 <w:sz w:val="20"/>
                 <w:szCs w:val="20"/>
               </w:rPr>
-              <w:t xml:space="preserve">Geladeira na rota do campus e do coworking, combo e cupom de recompra</w:t>
+              <w:t xml:space="preserve">Geladeira na rota do campus e do </w:t>
+            </w:r>
+            <w:r>
+              <w:rPr>
+                <w:rFonts w:ascii="Times New Roman" w:cs="Times New Roman" w:eastAsia="Times New Roman" w:hAnsi="Times New Roman"/>
+                <w:i w:val="1"/>
+                <w:iCs w:val="1"/>
+                <w:sz w:val="20"/>
+                <w:szCs w:val="20"/>
+              </w:rPr>
+              <w:t xml:space="preserve">coworking</w:t>
+            </w:r>
+            <w:r>
+              <w:rPr>
+                <w:rFonts w:ascii="Times New Roman" w:cs="Times New Roman" w:eastAsia="Times New Roman" w:hAnsi="Times New Roman"/>
+                <w:sz w:val="20"/>
+                <w:szCs w:val="20"/>
+              </w:rPr>
+              <w:t xml:space="preserve">, combo e cupom de recompra</w:t>
             </w:r>
           </w:p>
         </w:tc>
@@ -12417,7 +12475,7 @@
                 <w:sz w:val="20"/>
                 <w:szCs w:val="20"/>
               </w:rPr>
-              <w:t xml:space="preserve">“Asas para as suas conquistas diárias.” A promessa é energia para o momento de foco que constrói a conquista do dia. Cada ação tem uma mensagem de apoio derivada da central (Quadro 10).</w:t>
+              <w:t xml:space="preserve">“Asas para as suas conquistas diárias.” A promessa é energia para o momento de foco que constrói a conquista do dia. Cada ação tem uma mensagem de apoio derivada da mensagem central (Quadro 10).</w:t>
             </w:r>
           </w:p>
         </w:tc>
@@ -12498,7 +12556,25 @@
                 <w:sz w:val="20"/>
                 <w:szCs w:val="20"/>
               </w:rPr>
-              <w:t xml:space="preserve">Inspirador e próximo, com humor leve e o vocabulário real de quem estuda e trabalha (entrega, prazo, TCC, sprint). Confiante sem exagero: fala da ocasião de uso e não promete efeito sobre o desempenho. Valoriza foco com pausa e não glamoriza noites sem dormir.</w:t>
+              <w:t xml:space="preserve">Inspirador e próximo, com humor leve e o vocabulário real de quem estuda e trabalha (entrega, prazo, TCC, </w:t>
+            </w:r>
+            <w:r>
+              <w:rPr>
+                <w:rFonts w:ascii="Times New Roman" w:cs="Times New Roman" w:eastAsia="Times New Roman" w:hAnsi="Times New Roman"/>
+                <w:i w:val="1"/>
+                <w:iCs w:val="1"/>
+                <w:sz w:val="20"/>
+                <w:szCs w:val="20"/>
+              </w:rPr>
+              <w:t xml:space="preserve">sprint</w:t>
+            </w:r>
+            <w:r>
+              <w:rPr>
+                <w:rFonts w:ascii="Times New Roman" w:cs="Times New Roman" w:eastAsia="Times New Roman" w:hAnsi="Times New Roman"/>
+                <w:sz w:val="20"/>
+                <w:szCs w:val="20"/>
+              </w:rPr>
+              <w:t xml:space="preserve">). Confiante sem exagero: fala da ocasião de uso e não promete efeito sobre o desempenho. Valoriza foco com pausa e não romantiza noites sem dormir.</w:t>
             </w:r>
           </w:p>
         </w:tc>
@@ -12579,7 +12655,25 @@
                 <w:sz w:val="20"/>
                 <w:szCs w:val="20"/>
               </w:rPr>
-              <w:t xml:space="preserve">Mantém os códigos da marca (lata azul e prata, logotipo dos touros), o que garante reconhecimento e preserva a essência. Mecanismo visual próprio: grafismos de transmissão esportiva (cronômetro, altitude, velocidade) sobre cenas reais de biblioteca, home office e coworking, com pessoas diversas de 18 a 35 anos e luz natural.</w:t>
+              <w:t xml:space="preserve">Mantém os elementos da marca (lata azul e prata, logotipo dos touros), o que garante reconhecimento e preserva a essência. Como recurso visual próprio, usa grafismos de transmissão esportiva (cronômetro, altitude, velocidade) sobre cenas reais de biblioteca, home office e </w:t>
+            </w:r>
+            <w:r>
+              <w:rPr>
+                <w:rFonts w:ascii="Times New Roman" w:cs="Times New Roman" w:eastAsia="Times New Roman" w:hAnsi="Times New Roman"/>
+                <w:i w:val="1"/>
+                <w:iCs w:val="1"/>
+                <w:sz w:val="20"/>
+                <w:szCs w:val="20"/>
+              </w:rPr>
+              <w:t xml:space="preserve">coworking</w:t>
+            </w:r>
+            <w:r>
+              <w:rPr>
+                <w:rFonts w:ascii="Times New Roman" w:cs="Times New Roman" w:eastAsia="Times New Roman" w:hAnsi="Times New Roman"/>
+                <w:sz w:val="20"/>
+                <w:szCs w:val="20"/>
+              </w:rPr>
+              <w:t xml:space="preserve">, com pessoas diversas de 18 a 35 anos e luz natural.</w:t>
             </w:r>
           </w:p>
         </w:tc>
@@ -13482,7 +13576,7 @@
                 <w:sz w:val="18"/>
                 <w:szCs w:val="18"/>
               </w:rPr>
-              <w:t xml:space="preserve">Alcance qualificado; retenção de 75% do vídeo; lift de associação (painel 1, 2 e 3)</w:t>
+              <w:t xml:space="preserve">Alcance qualificado; retenção de 75% do vídeo; aumento da associação (painel 1, 2 e 3)</w:t>
             </w:r>
           </w:p>
         </w:tc>
@@ -13707,7 +13801,35 @@
                 <w:sz w:val="18"/>
                 <w:szCs w:val="18"/>
               </w:rPr>
-              <w:t xml:space="preserve">Página no site da Red Bull Brasil (guias de rotina de foco, comparação com café, composição, perguntas frequentes, links para iFood, Rappi e PDV); playlist Modo Foco; carrosséis; remarketing</w:t>
+              <w:t xml:space="preserve">Página no site da Red Bull Brasil (guias de rotina de foco, comparação com café, composição, perguntas frequentes, links para iFood, Rappi e PDV); </w:t>
+            </w:r>
+            <w:r>
+              <w:rPr>
+                <w:rFonts w:ascii="Times New Roman" w:cs="Times New Roman" w:eastAsia="Times New Roman" w:hAnsi="Times New Roman"/>
+                <w:i w:val="1"/>
+                <w:iCs w:val="1"/>
+                <w:sz w:val="18"/>
+                <w:szCs w:val="18"/>
+              </w:rPr>
+              <w:t xml:space="preserve">playlist</w:t>
+            </w:r>
+            <w:r>
+              <w:rPr>
+                <w:rFonts w:ascii="Times New Roman" w:cs="Times New Roman" w:eastAsia="Times New Roman" w:hAnsi="Times New Roman"/>
+                <w:sz w:val="18"/>
+                <w:szCs w:val="18"/>
+              </w:rPr>
+              <w:t xml:space="preserve"> Modo Foco; carrosséis; </w:t>
+            </w:r>
+            <w:r>
+              <w:rPr>
+                <w:rFonts w:ascii="Times New Roman" w:cs="Times New Roman" w:eastAsia="Times New Roman" w:hAnsi="Times New Roman"/>
+                <w:i w:val="1"/>
+                <w:iCs w:val="1"/>
+                <w:sz w:val="18"/>
+                <w:szCs w:val="18"/>
+              </w:rPr>
+              <w:t xml:space="preserve">remarketing</w:t>
             </w:r>
           </w:p>
         </w:tc>
@@ -14040,7 +14162,25 @@
                 <w:sz w:val="18"/>
                 <w:szCs w:val="18"/>
               </w:rPr>
-              <w:t xml:space="preserve">Chamada #MeuVooDeHoje para conteúdo de usuários (com regulamento e curadoria); depoimentos em stories; pauta de imprensa com dados da pesquisa de linha de base; histórias de participantes brasileiros do Red Bull Basement</w:t>
+              <w:t xml:space="preserve">Chamada #MeuVooDeHoje para conteúdo feito pelos usuários (com regulamento e curadoria); depoimentos em </w:t>
+            </w:r>
+            <w:r>
+              <w:rPr>
+                <w:rFonts w:ascii="Times New Roman" w:cs="Times New Roman" w:eastAsia="Times New Roman" w:hAnsi="Times New Roman"/>
+                <w:i w:val="1"/>
+                <w:iCs w:val="1"/>
+                <w:sz w:val="18"/>
+                <w:szCs w:val="18"/>
+              </w:rPr>
+              <w:t xml:space="preserve">stories</w:t>
+            </w:r>
+            <w:r>
+              <w:rPr>
+                <w:rFonts w:ascii="Times New Roman" w:cs="Times New Roman" w:eastAsia="Times New Roman" w:hAnsi="Times New Roman"/>
+                <w:sz w:val="18"/>
+                <w:szCs w:val="18"/>
+              </w:rPr>
+              <w:t xml:space="preserve">; pauta de imprensa com dados da pesquisa de linha de base; histórias de participantes brasileiros do Red Bull Basement</w:t>
             </w:r>
           </w:p>
         </w:tc>
@@ -14148,7 +14288,25 @@
                 <w:sz w:val="18"/>
                 <w:szCs w:val="18"/>
               </w:rPr>
-              <w:t xml:space="preserve">Participação qualificada por mil pessoas alcançadas; sentimento e share of voice no tema foco e estudo (painel 3 e 4)</w:t>
+              <w:t xml:space="preserve">Participação qualificada por mil pessoas alcançadas; sentimento e </w:t>
+            </w:r>
+            <w:r>
+              <w:rPr>
+                <w:rFonts w:ascii="Times New Roman" w:cs="Times New Roman" w:eastAsia="Times New Roman" w:hAnsi="Times New Roman"/>
+                <w:i w:val="1"/>
+                <w:iCs w:val="1"/>
+                <w:sz w:val="18"/>
+                <w:szCs w:val="18"/>
+              </w:rPr>
+              <w:t xml:space="preserve">share of voice</w:t>
+            </w:r>
+            <w:r>
+              <w:rPr>
+                <w:rFonts w:ascii="Times New Roman" w:cs="Times New Roman" w:eastAsia="Times New Roman" w:hAnsi="Times New Roman"/>
+                <w:sz w:val="18"/>
+                <w:szCs w:val="18"/>
+              </w:rPr>
+              <w:t xml:space="preserve"> no tema foco e estudo (painel 3 e 4)</w:t>
             </w:r>
           </w:p>
         </w:tc>
@@ -14301,7 +14459,25 @@
                 <w:sz w:val="18"/>
                 <w:szCs w:val="18"/>
               </w:rPr>
-              <w:t xml:space="preserve">Universitários maiores de 18 anos e usuários de coworkings nas 5 praças, em semanas de provas e entregas</w:t>
+              <w:t xml:space="preserve">Universitários maiores de 18 anos e usuários de </w:t>
+            </w:r>
+            <w:r>
+              <w:rPr>
+                <w:rFonts w:ascii="Times New Roman" w:cs="Times New Roman" w:eastAsia="Times New Roman" w:hAnsi="Times New Roman"/>
+                <w:i w:val="1"/>
+                <w:iCs w:val="1"/>
+                <w:sz w:val="18"/>
+                <w:szCs w:val="18"/>
+              </w:rPr>
+              <w:t xml:space="preserve">coworkings</w:t>
+            </w:r>
+            <w:r>
+              <w:rPr>
+                <w:rFonts w:ascii="Times New Roman" w:cs="Times New Roman" w:eastAsia="Times New Roman" w:hAnsi="Times New Roman"/>
+                <w:sz w:val="18"/>
+                <w:szCs w:val="18"/>
+              </w:rPr>
+              <w:t xml:space="preserve"> nas 5 cidades, em semanas de provas e entregas</w:t>
             </w:r>
           </w:p>
         </w:tc>
@@ -14373,7 +14549,25 @@
                 <w:sz w:val="18"/>
                 <w:szCs w:val="18"/>
               </w:rPr>
-              <w:t xml:space="preserve">Estações de pausa em bibliotecas, áreas de convivência e coworkings parceiros: lata gelada com checagem de idade, tomadas, cartão com rotina de foco, QR para o Hub e cupom no aplicativo</w:t>
+              <w:t xml:space="preserve">Estações de pausa em bibliotecas, áreas de convivência e </w:t>
+            </w:r>
+            <w:r>
+              <w:rPr>
+                <w:rFonts w:ascii="Times New Roman" w:cs="Times New Roman" w:eastAsia="Times New Roman" w:hAnsi="Times New Roman"/>
+                <w:i w:val="1"/>
+                <w:iCs w:val="1"/>
+                <w:sz w:val="18"/>
+                <w:szCs w:val="18"/>
+              </w:rPr>
+              <w:t xml:space="preserve">coworkings</w:t>
+            </w:r>
+            <w:r>
+              <w:rPr>
+                <w:rFonts w:ascii="Times New Roman" w:cs="Times New Roman" w:eastAsia="Times New Roman" w:hAnsi="Times New Roman"/>
+                <w:sz w:val="18"/>
+                <w:szCs w:val="18"/>
+              </w:rPr>
+              <w:t xml:space="preserve"> parceiros: lata gelada com checagem de idade, tomadas, cartão com rotina de foco, QR para o Hub e cupom no aplicativo</w:t>
             </w:r>
           </w:p>
         </w:tc>
@@ -14634,7 +14828,25 @@
                 <w:sz w:val="18"/>
                 <w:szCs w:val="18"/>
               </w:rPr>
-              <w:t xml:space="preserve">Público quente e passantes do público prioritário em lojas perto de universidades, coworkings e escritórios</w:t>
+              <w:t xml:space="preserve">Público quente e passantes do público prioritário em lojas perto de universidades, </w:t>
+            </w:r>
+            <w:r>
+              <w:rPr>
+                <w:rFonts w:ascii="Times New Roman" w:cs="Times New Roman" w:eastAsia="Times New Roman" w:hAnsi="Times New Roman"/>
+                <w:i w:val="1"/>
+                <w:iCs w:val="1"/>
+                <w:sz w:val="18"/>
+                <w:szCs w:val="18"/>
+              </w:rPr>
+              <w:t xml:space="preserve">coworkings</w:t>
+            </w:r>
+            <w:r>
+              <w:rPr>
+                <w:rFonts w:ascii="Times New Roman" w:cs="Times New Roman" w:eastAsia="Times New Roman" w:hAnsi="Times New Roman"/>
+                <w:sz w:val="18"/>
+                <w:szCs w:val="18"/>
+              </w:rPr>
+              <w:t xml:space="preserve"> e escritórios</w:t>
             </w:r>
           </w:p>
         </w:tc>
@@ -14706,7 +14918,61 @@
                 <w:sz w:val="18"/>
                 <w:szCs w:val="18"/>
               </w:rPr>
-              <w:t xml:space="preserve">Testeira e adesivo de geladeira, wobbler, display de caixa, combo lata + snack e QR para o Hub nas lojas participantes; lojas semelhantes sem material como grupo de controle</w:t>
+              <w:t xml:space="preserve">Testeira e adesivo de geladeira, </w:t>
+            </w:r>
+            <w:r>
+              <w:rPr>
+                <w:rFonts w:ascii="Times New Roman" w:cs="Times New Roman" w:eastAsia="Times New Roman" w:hAnsi="Times New Roman"/>
+                <w:i w:val="1"/>
+                <w:iCs w:val="1"/>
+                <w:sz w:val="18"/>
+                <w:szCs w:val="18"/>
+              </w:rPr>
+              <w:t xml:space="preserve">wobbler</w:t>
+            </w:r>
+            <w:r>
+              <w:rPr>
+                <w:rFonts w:ascii="Times New Roman" w:cs="Times New Roman" w:eastAsia="Times New Roman" w:hAnsi="Times New Roman"/>
+                <w:sz w:val="18"/>
+                <w:szCs w:val="18"/>
+              </w:rPr>
+              <w:t xml:space="preserve">, </w:t>
+            </w:r>
+            <w:r>
+              <w:rPr>
+                <w:rFonts w:ascii="Times New Roman" w:cs="Times New Roman" w:eastAsia="Times New Roman" w:hAnsi="Times New Roman"/>
+                <w:i w:val="1"/>
+                <w:iCs w:val="1"/>
+                <w:sz w:val="18"/>
+                <w:szCs w:val="18"/>
+              </w:rPr>
+              <w:t xml:space="preserve">display</w:t>
+            </w:r>
+            <w:r>
+              <w:rPr>
+                <w:rFonts w:ascii="Times New Roman" w:cs="Times New Roman" w:eastAsia="Times New Roman" w:hAnsi="Times New Roman"/>
+                <w:sz w:val="18"/>
+                <w:szCs w:val="18"/>
+              </w:rPr>
+              <w:t xml:space="preserve"> de caixa, combo lata + </w:t>
+            </w:r>
+            <w:r>
+              <w:rPr>
+                <w:rFonts w:ascii="Times New Roman" w:cs="Times New Roman" w:eastAsia="Times New Roman" w:hAnsi="Times New Roman"/>
+                <w:i w:val="1"/>
+                <w:iCs w:val="1"/>
+                <w:sz w:val="18"/>
+                <w:szCs w:val="18"/>
+              </w:rPr>
+              <w:t xml:space="preserve">snack</w:t>
+            </w:r>
+            <w:r>
+              <w:rPr>
+                <w:rFonts w:ascii="Times New Roman" w:cs="Times New Roman" w:eastAsia="Times New Roman" w:hAnsi="Times New Roman"/>
+                <w:sz w:val="18"/>
+                <w:szCs w:val="18"/>
+              </w:rPr>
+              <w:t xml:space="preserve"> e QR para o Hub nas lojas participantes; lojas semelhantes sem material como grupo de controle</w:t>
             </w:r>
           </w:p>
         </w:tc>
@@ -15039,7 +15305,25 @@
                 <w:sz w:val="18"/>
                 <w:szCs w:val="18"/>
               </w:rPr>
-              <w:t xml:space="preserve">iFood e Rappi: combo Red Bull + snack, vitrine patrocinada e banners, cupom de primeira compra (vindo de A4) e de recompra em 30 dias, notificações nas semanas de provas</w:t>
+              <w:t xml:space="preserve">iFood e Rappi: combo Red Bull + </w:t>
+            </w:r>
+            <w:r>
+              <w:rPr>
+                <w:rFonts w:ascii="Times New Roman" w:cs="Times New Roman" w:eastAsia="Times New Roman" w:hAnsi="Times New Roman"/>
+                <w:i w:val="1"/>
+                <w:iCs w:val="1"/>
+                <w:sz w:val="18"/>
+                <w:szCs w:val="18"/>
+              </w:rPr>
+              <w:t xml:space="preserve">snack</w:t>
+            </w:r>
+            <w:r>
+              <w:rPr>
+                <w:rFonts w:ascii="Times New Roman" w:cs="Times New Roman" w:eastAsia="Times New Roman" w:hAnsi="Times New Roman"/>
+                <w:sz w:val="18"/>
+                <w:szCs w:val="18"/>
+              </w:rPr>
+              <w:t xml:space="preserve">, vitrine patrocinada e banners, cupom de primeira compra (vindo de A4) e de recompra em 30 dias, notificações nas semanas de provas</w:t>
             </w:r>
           </w:p>
         </w:tc>
@@ -15917,7 +16201,7 @@
                 <w:sz w:val="18"/>
                 <w:szCs w:val="18"/>
               </w:rPr>
-              <w:t xml:space="preserve">O problema é de percepção: a associação exclusiva ao radical. Sem ressignificar o “voar”, as ações de conversão falariam com quem ainda acha que o produto não é para si.</w:t>
+              <w:t xml:space="preserve">O problema é de percepção, pois a marca é associada só aos esportes radicais. Sem ressignificar o “voar”, as ações de conversão falariam com quem ainda acha que o produto não é para si.</w:t>
             </w:r>
           </w:p>
         </w:tc>
@@ -16025,7 +16309,25 @@
                 <w:sz w:val="18"/>
                 <w:szCs w:val="18"/>
               </w:rPr>
-              <w:t xml:space="preserve">Primeiro contato. Quem assiste a 50% ou mais do vídeo recebe remarketing de A2 e A3.</w:t>
+              <w:t xml:space="preserve">Primeiro contato. Quem assiste a 50% ou mais do vídeo recebe </w:t>
+            </w:r>
+            <w:r>
+              <w:rPr>
+                <w:rFonts w:ascii="Times New Roman" w:cs="Times New Roman" w:eastAsia="Times New Roman" w:hAnsi="Times New Roman"/>
+                <w:i w:val="1"/>
+                <w:iCs w:val="1"/>
+                <w:sz w:val="18"/>
+                <w:szCs w:val="18"/>
+              </w:rPr>
+              <w:t xml:space="preserve">remarketing</w:t>
+            </w:r>
+            <w:r>
+              <w:rPr>
+                <w:rFonts w:ascii="Times New Roman" w:cs="Times New Roman" w:eastAsia="Times New Roman" w:hAnsi="Times New Roman"/>
+                <w:sz w:val="18"/>
+                <w:szCs w:val="18"/>
+              </w:rPr>
+              <w:t xml:space="preserve"> de A2 e A3.</w:t>
             </w:r>
           </w:p>
         </w:tc>
@@ -16061,7 +16363,7 @@
                 <w:sz w:val="18"/>
                 <w:szCs w:val="18"/>
               </w:rPr>
-              <w:t xml:space="preserve">Lift de associação significativo entre expostos e não expostos; retenção acima da linha de base (painel 2 e 3).</w:t>
+              <w:t xml:space="preserve">Aumento significativo da associação entre expostos e não expostos; retenção acima da linha de base (painel 2 e 3).</w:t>
             </w:r>
           </w:p>
         </w:tc>
@@ -16367,7 +16669,7 @@
                 <w:sz w:val="18"/>
                 <w:szCs w:val="18"/>
               </w:rPr>
-              <w:t xml:space="preserve">Testa a hipótese 2 da Parte 1 (o conteúdo gera alcance orgânico) no novo território. A prova social reduz a resistência descrita no insight.</w:t>
+              <w:t xml:space="preserve">Testa a hipótese 2 da Parte 1 (o conteúdo gera alcance orgânico) no novo posicionamento. A prova social reduz a resistência descrita no insight.</w:t>
             </w:r>
           </w:p>
         </w:tc>
@@ -16817,7 +17119,7 @@
                 <w:sz w:val="18"/>
                 <w:szCs w:val="18"/>
               </w:rPr>
-              <w:t xml:space="preserve">Preço premium e concorrência do café e de energéticos de baixo custo. No PDV a escolha é rápida: a marca precisa lembrar a ocasião de foco, e não disputar preço.</w:t>
+              <w:t xml:space="preserve">Preço premium e concorrência do café e de energéticos de baixo custo. No PDV, a escolha é rápida: a marca precisa lembrar a ocasião de foco, e não disputar preço.</w:t>
             </w:r>
           </w:p>
         </w:tc>
@@ -17492,7 +17794,7 @@
           <w:sz w:val="24"/>
           <w:szCs w:val="24"/>
         </w:rPr>
-        <w:t xml:space="preserve">O cronograma é organizado em ondas, para que o público receba a mensagem na ordem certa: primeiro a atenção e a nova associação, depois a explicação e as provas, então o convite à compra e, por fim, o relacionamento (SOUZA, 2026c).</w:t>
+        <w:t xml:space="preserve">Organizamos o cronograma em ondas, para que o público receba a mensagem na ordem certa. Primeiro vêm a atenção e a nova associação, depois a explicação e as provas, em seguida o convite à compra e, por fim, o relacionamento (SOUZA, 2026c).</w:t>
       </w:r>
     </w:p>
     <w:p>
@@ -17870,7 +18172,43 @@
                 <w:sz w:val="20"/>
                 <w:szCs w:val="20"/>
               </w:rPr>
-              <w:t xml:space="preserve">Contratação e briefing dos criadores; produção dos 6 primeiros vídeos, do Hub e das peças de PDV; acordos com iFood, Rappi, universidades e coworkings; revisão jurídica e regulatória; pesquisa de linha de base; montagem do painel</w:t>
+              <w:t xml:space="preserve">Contratação e </w:t>
+            </w:r>
+            <w:r>
+              <w:rPr>
+                <w:rFonts w:ascii="Times New Roman" w:cs="Times New Roman" w:eastAsia="Times New Roman" w:hAnsi="Times New Roman"/>
+                <w:i w:val="1"/>
+                <w:iCs w:val="1"/>
+                <w:sz w:val="20"/>
+                <w:szCs w:val="20"/>
+              </w:rPr>
+              <w:t xml:space="preserve">briefing</w:t>
+            </w:r>
+            <w:r>
+              <w:rPr>
+                <w:rFonts w:ascii="Times New Roman" w:cs="Times New Roman" w:eastAsia="Times New Roman" w:hAnsi="Times New Roman"/>
+                <w:sz w:val="20"/>
+                <w:szCs w:val="20"/>
+              </w:rPr>
+              <w:t xml:space="preserve"> dos criadores; produção dos 6 primeiros vídeos, do Hub e das peças de PDV; acordos com iFood, Rappi, universidades e </w:t>
+            </w:r>
+            <w:r>
+              <w:rPr>
+                <w:rFonts w:ascii="Times New Roman" w:cs="Times New Roman" w:eastAsia="Times New Roman" w:hAnsi="Times New Roman"/>
+                <w:i w:val="1"/>
+                <w:iCs w:val="1"/>
+                <w:sz w:val="20"/>
+                <w:szCs w:val="20"/>
+              </w:rPr>
+              <w:t xml:space="preserve">coworkings</w:t>
+            </w:r>
+            <w:r>
+              <w:rPr>
+                <w:rFonts w:ascii="Times New Roman" w:cs="Times New Roman" w:eastAsia="Times New Roman" w:hAnsi="Times New Roman"/>
+                <w:sz w:val="20"/>
+                <w:szCs w:val="20"/>
+              </w:rPr>
+              <w:t xml:space="preserve">; revisão jurídica e regulatória; pesquisa de linha de base; montagem do painel</w:t>
             </w:r>
           </w:p>
         </w:tc>
@@ -18248,7 +18586,25 @@
                 <w:sz w:val="20"/>
                 <w:szCs w:val="20"/>
               </w:rPr>
-              <w:t xml:space="preserve">Mais 6 vídeos; chamada #MeuVooDeHoje e depoimentos; remarketing para o Hub; combo no ar nos aplicativos; abertura do Diário de Bordo</w:t>
+              <w:t xml:space="preserve">Mais 6 vídeos; chamada #MeuVooDeHoje e depoimentos; </w:t>
+            </w:r>
+            <w:r>
+              <w:rPr>
+                <w:rFonts w:ascii="Times New Roman" w:cs="Times New Roman" w:eastAsia="Times New Roman" w:hAnsi="Times New Roman"/>
+                <w:i w:val="1"/>
+                <w:iCs w:val="1"/>
+                <w:sz w:val="20"/>
+                <w:szCs w:val="20"/>
+              </w:rPr>
+              <w:t xml:space="preserve">remarketing</w:t>
+            </w:r>
+            <w:r>
+              <w:rPr>
+                <w:rFonts w:ascii="Times New Roman" w:cs="Times New Roman" w:eastAsia="Times New Roman" w:hAnsi="Times New Roman"/>
+                <w:sz w:val="20"/>
+                <w:szCs w:val="20"/>
+              </w:rPr>
+              <w:t xml:space="preserve"> para o Hub; combo no ar nos aplicativos; abertura do Diário de Bordo</w:t>
             </w:r>
           </w:p>
         </w:tc>
@@ -18752,7 +19108,7 @@
           <w:sz w:val="24"/>
           <w:szCs w:val="24"/>
         </w:rPr>
-        <w:t xml:space="preserve"> três semanas de preparação são suficientes porque o plano usa ativos que a marca já tem (identidade visual, Red Bull Media House, rede de distribuição e geladeiras instaladas). As peças de PDV são adaptações, como adesivos e testeiras, e não equipamentos novos. Os vídeos são produzidos em dois lotes, para que o segundo já incorpore o aprendizado do primeiro.</w:t>
+        <w:t xml:space="preserve"> consideramos que três semanas de preparação são suficientes, pois o plano usa recursos que a marca já tem, como a identidade visual, a Red Bull Media House, a rede de distribuição e as geladeiras instaladas. As peças de PDV são apenas adaptações, como adesivos e testeiras, e não equipamentos novos. Além disso, os vídeos são produzidos em dois lotes, para que o segundo já aproveite o que foi aprendido com o primeiro.</w:t>
       </w:r>
     </w:p>
     <w:p>
@@ -23618,7 +23974,7 @@
                 <w:sz w:val="18"/>
                 <w:szCs w:val="18"/>
               </w:rPr>
-              <w:t xml:space="preserve">Risco e mitigação</w:t>
+              <w:t xml:space="preserve">Risco e prevenção</w:t>
             </w:r>
           </w:p>
         </w:tc>
@@ -23843,7 +24199,7 @@
                 <w:sz w:val="18"/>
                 <w:szCs w:val="18"/>
               </w:rPr>
-              <w:t xml:space="preserve">Criador envolvido em polêmica ou que glamorize noites sem dormir. Mitigação: contrato com cláusulas de conduta, roteiro aprovado e aviso de consumo responsável.</w:t>
+              <w:t xml:space="preserve">Criador envolvido em polêmica ou que romantize noites sem dormir. Prevenção: contrato com cláusulas de conduta, roteiro aprovado e aviso de consumo responsável.</w:t>
             </w:r>
           </w:p>
         </w:tc>
@@ -24068,7 +24424,7 @@
                 <w:sz w:val="18"/>
                 <w:szCs w:val="18"/>
               </w:rPr>
-              <w:t xml:space="preserve">Alegação funcional indevida, como prometer melhora de desempenho. Mitigação: falar da ocasião de uso, com texto revisado.</w:t>
+              <w:t xml:space="preserve">Alegação funcional indevida, como prometer melhora de desempenho. Prevenção: falar da ocasião de uso, com texto revisado.</w:t>
             </w:r>
           </w:p>
         </w:tc>
@@ -24185,7 +24541,7 @@
                 <w:sz w:val="18"/>
                 <w:szCs w:val="18"/>
               </w:rPr>
-              <w:t xml:space="preserve">Agência de social, Gerência de Marca</w:t>
+              <w:t xml:space="preserve">Agência de redes sociais, Gerência de Marca</w:t>
             </w:r>
           </w:p>
         </w:tc>
@@ -24293,7 +24649,7 @@
                 <w:sz w:val="18"/>
                 <w:szCs w:val="18"/>
               </w:rPr>
-              <w:t xml:space="preserve">Conteúdo com consumo excessivo ou com menores de idade. Mitigação: regulamento só para maiores de 18, moderação e autorização de uso de imagem.</w:t>
+              <w:t xml:space="preserve">Conteúdo com consumo excessivo ou com menores de idade. Prevenção: regulamento só para maiores de 18, moderação e autorização de uso de imagem.</w:t>
             </w:r>
           </w:p>
         </w:tc>
@@ -24518,7 +24874,25 @@
                 <w:sz w:val="18"/>
                 <w:szCs w:val="18"/>
               </w:rPr>
-              <w:t xml:space="preserve">Instituição não autorizar a ação. Mitigação: priorizar coworkings e o entorno dos campi; checagem de idade.</w:t>
+              <w:t xml:space="preserve">Instituição não autorizar a ação. Prevenção: priorizar </w:t>
+            </w:r>
+            <w:r>
+              <w:rPr>
+                <w:rFonts w:ascii="Times New Roman" w:cs="Times New Roman" w:eastAsia="Times New Roman" w:hAnsi="Times New Roman"/>
+                <w:i w:val="1"/>
+                <w:iCs w:val="1"/>
+                <w:sz w:val="18"/>
+                <w:szCs w:val="18"/>
+              </w:rPr>
+              <w:t xml:space="preserve">coworkings</w:t>
+            </w:r>
+            <w:r>
+              <w:rPr>
+                <w:rFonts w:ascii="Times New Roman" w:cs="Times New Roman" w:eastAsia="Times New Roman" w:hAnsi="Times New Roman"/>
+                <w:sz w:val="18"/>
+                <w:szCs w:val="18"/>
+              </w:rPr>
+              <w:t xml:space="preserve"> e o entorno dos campi; checagem de idade.</w:t>
             </w:r>
           </w:p>
         </w:tc>
@@ -24743,7 +25117,7 @@
                 <w:sz w:val="18"/>
                 <w:szCs w:val="18"/>
               </w:rPr>
-              <w:t xml:space="preserve">Material não instalado ou falta de produto. Mitigação: auditoria fotográfica semanal e reposição prioritária.</w:t>
+              <w:t xml:space="preserve">Material não instalado ou falta de produto. Prevenção: auditoria fotográfica semanal e reposição prioritária.</w:t>
             </w:r>
           </w:p>
         </w:tc>
@@ -24968,7 +25342,7 @@
                 <w:sz w:val="18"/>
                 <w:szCs w:val="18"/>
               </w:rPr>
-              <w:t xml:space="preserve">Falta de produto nos parceiros ou conflito de preço com o varejo. Mitigação: seleção de parceiros e preço sugerido.</w:t>
+              <w:t xml:space="preserve">Falta de produto nos parceiros ou conflito de preço com o varejo. Prevenção: seleção de parceiros e preço sugerido.</w:t>
             </w:r>
           </w:p>
         </w:tc>
@@ -25193,7 +25567,7 @@
                 <w:sz w:val="18"/>
                 <w:szCs w:val="18"/>
               </w:rPr>
-              <w:t xml:space="preserve">Baixa adesão ou uso indevido de dados. Mitigação: consentimento explícito e no máximo um contato por semana.</w:t>
+              <w:t xml:space="preserve">Baixa adesão ou uso indevido de dados. Prevenção: consentimento explícito e no máximo um contato por semana.</w:t>
             </w:r>
           </w:p>
         </w:tc>
@@ -25387,7 +25761,7 @@
                 <w:sz w:val="18"/>
                 <w:szCs w:val="18"/>
               </w:rPr>
-              <w:t xml:space="preserve">Linha de base até S3; pós na S13</w:t>
+              <w:t xml:space="preserve">Linha de base até S3; pós-campanha na S13</w:t>
             </w:r>
           </w:p>
         </w:tc>
@@ -25424,7 +25798,7 @@
                 <w:sz w:val="18"/>
                 <w:szCs w:val="18"/>
               </w:rPr>
-              <w:t xml:space="preserve">Atraso na linha de base, o que impediria a comparação. Mitigação: contratar a pesquisa já na S1.</w:t>
+              <w:t xml:space="preserve">Atraso na linha de base, o que impediria a comparação. Prevenção: contratar a pesquisa já na S1.</w:t>
             </w:r>
           </w:p>
         </w:tc>
@@ -25501,7 +25875,7 @@
           <w:sz w:val="24"/>
           <w:szCs w:val="24"/>
         </w:rPr>
-        <w:t xml:space="preserve"> participam os responsáveis pelas ações e a Inteligência de Mercado. Pauta fixa: (1) painel da semana; (2) desvios em relação às metas; (3) riscos e bloqueios; (4) decisões.</w:t>
+        <w:t xml:space="preserve"> participam os responsáveis pelas ações e a área de Inteligência de Mercado. A pauta é sempre a mesma e segue quatro pontos: o painel da semana, os desvios em relação às metas, os riscos e bloqueios e, por fim, as decisões.</w:t>
       </w:r>
     </w:p>
     <w:p>
@@ -25534,7 +25908,7 @@
           <w:sz w:val="24"/>
           <w:szCs w:val="24"/>
         </w:rPr>
-        <w:t xml:space="preserve"> cada decisão vai para uma planilha compartilhada com data, decisão, motivo, responsável e prazo. Essa planilha é a memória usada no relatório final.</w:t>
+        <w:t xml:space="preserve"> cada decisão é anotada em uma planilha compartilhada, com a data, o que foi decidido, o motivo, o responsável e o prazo. Essa planilha funciona como o histórico do projeto e é usada na elaboração do relatório final.</w:t>
       </w:r>
     </w:p>
     <w:p>
@@ -25567,7 +25941,7 @@
           <w:sz w:val="24"/>
           <w:szCs w:val="24"/>
         </w:rPr>
-        <w:t xml:space="preserve"> reunião de uma hora com a Diretoria de Marketing para decidir o uso da reserva de mídia (R$ 150 mil, seção 12) nas ações que estiverem acima da meta.</w:t>
+        <w:t xml:space="preserve"> reunião de uma hora com a Diretoria de Marketing para decidir como usar a reserva de mídia (R$ 150 mil, seção 12) nas ações que estiverem acima da meta.</w:t>
       </w:r>
     </w:p>
     <w:p>
@@ -25600,7 +25974,7 @@
           <w:sz w:val="24"/>
           <w:szCs w:val="24"/>
         </w:rPr>
-        <w:t xml:space="preserve"> apresentação do relatório final (resultado, interpretação, aprendizado e próximos passos) e decisão sobre cada ação (seção 14).</w:t>
+        <w:t xml:space="preserve"> é o momento de apresentar o relatório final, com o resultado, a interpretação, o aprendizado e os próximos passos, e de decidir o que será feito com cada ação (seção 14).</w:t>
       </w:r>
     </w:p>
     <w:p>
@@ -25666,7 +26040,7 @@
           <w:sz w:val="24"/>
           <w:szCs w:val="24"/>
         </w:rPr>
-        <w:t xml:space="preserve">Valores em reais, estimados pelo grupo. Não são custos reais da Red Bull nem cotações de fornecedores.</w:t>
+        <w:t xml:space="preserve">Os valores estão em reais e foram estimados pelo grupo. Não são custos reais da Red Bull nem cotações de fornecedores.</w:t>
       </w:r>
     </w:p>
     <w:p>
@@ -25689,7 +26063,7 @@
           <w:sz w:val="24"/>
           <w:szCs w:val="24"/>
         </w:rPr>
-        <w:t xml:space="preserve">Escopo de 13 semanas, com ações digitais nacionais e ações presenciais em cinco praças-piloto.</w:t>
+        <w:t xml:space="preserve">O plano tem duração de 13 semanas, com ações digitais em todo o país e ações presenciais em cinco cidades-piloto.</w:t>
       </w:r>
     </w:p>
     <w:p>
@@ -25712,7 +26086,7 @@
           <w:sz w:val="24"/>
           <w:szCs w:val="24"/>
         </w:rPr>
-        <w:t xml:space="preserve">A verba de mídia é uma verba de teste, suficiente para medir o efeito, e não para o alcance máximo. Os custos de mídia não foram cotados; quando um custo entra no cálculo de uma meta, ele aparece como premissa fictícia.</w:t>
+        <w:t xml:space="preserve">A verba de mídia é uma verba de teste, ou seja, é suficiente para medir o efeito da campanha, mas não busca o alcance máximo. Como não cotamos os custos de mídia, sempre que um deles entra no cálculo de uma meta, ele aparece como premissa fictícia.</w:t>
       </w:r>
     </w:p>
     <w:p>
@@ -25735,7 +26109,7 @@
           <w:sz w:val="24"/>
           <w:szCs w:val="24"/>
         </w:rPr>
-        <w:t xml:space="preserve">Inclui o produto usado em amostras e o subsídio de cupons, a valores fictícios.</w:t>
+        <w:t xml:space="preserve">O orçamento inclui o produto usado nas amostras e o subsídio dos cupons, com valores fictícios.</w:t>
       </w:r>
     </w:p>
     <w:p>
@@ -25758,7 +26132,7 @@
           <w:sz w:val="24"/>
           <w:szCs w:val="24"/>
         </w:rPr>
-        <w:t xml:space="preserve">Não inclui custos que a marca já tem: equipe interna fixa, geladeiras instaladas e patrocínios de esportes e eSports.</w:t>
+        <w:t xml:space="preserve">O orçamento não inclui os custos que a marca já tem, no caso, a equipe interna fixa, as geladeiras instaladas e os patrocínios de esportes e eSports.</w:t>
       </w:r>
     </w:p>
     <w:p>
@@ -26371,7 +26745,7 @@
                 <w:sz w:val="20"/>
                 <w:szCs w:val="20"/>
               </w:rPr>
-              <w:t xml:space="preserve">Estações modulares de ativação para 5 praças (A4)</w:t>
+              <w:t xml:space="preserve">Estações modulares de ativação para 5 cidades (A4)</w:t>
             </w:r>
           </w:p>
         </w:tc>
@@ -26838,10 +27212,20 @@
             <w:r>
               <w:rPr>
                 <w:rFonts w:ascii="Times New Roman" w:cs="Times New Roman" w:eastAsia="Times New Roman" w:hAnsi="Times New Roman"/>
-                <w:sz w:val="20"/>
-                <w:szCs w:val="20"/>
-              </w:rPr>
-              <w:t xml:space="preserve">Remarketing para o Hub e as provas (A2)</w:t>
+                <w:i w:val="1"/>
+                <w:iCs w:val="1"/>
+                <w:sz w:val="20"/>
+                <w:szCs w:val="20"/>
+              </w:rPr>
+              <w:t xml:space="preserve">Remarketing</w:t>
+            </w:r>
+            <w:r>
+              <w:rPr>
+                <w:rFonts w:ascii="Times New Roman" w:cs="Times New Roman" w:eastAsia="Times New Roman" w:hAnsi="Times New Roman"/>
+                <w:sz w:val="20"/>
+                <w:szCs w:val="20"/>
+              </w:rPr>
+              <w:t xml:space="preserve"> para o Hub e as provas (A2)</w:t>
             </w:r>
           </w:p>
         </w:tc>
@@ -28371,7 +28755,25 @@
                 <w:sz w:val="20"/>
                 <w:szCs w:val="20"/>
               </w:rPr>
-              <w:t xml:space="preserve">Estudos de brand lift nas plataformas de vídeo</w:t>
+              <w:t xml:space="preserve">Estudos de </w:t>
+            </w:r>
+            <w:r>
+              <w:rPr>
+                <w:rFonts w:ascii="Times New Roman" w:cs="Times New Roman" w:eastAsia="Times New Roman" w:hAnsi="Times New Roman"/>
+                <w:i w:val="1"/>
+                <w:iCs w:val="1"/>
+                <w:sz w:val="20"/>
+                <w:szCs w:val="20"/>
+              </w:rPr>
+              <w:t xml:space="preserve">brand lift</w:t>
+            </w:r>
+            <w:r>
+              <w:rPr>
+                <w:rFonts w:ascii="Times New Roman" w:cs="Times New Roman" w:eastAsia="Times New Roman" w:hAnsi="Times New Roman"/>
+                <w:sz w:val="20"/>
+                <w:szCs w:val="20"/>
+              </w:rPr>
+              <w:t xml:space="preserve"> nas plataformas de vídeo</w:t>
             </w:r>
           </w:p>
         </w:tc>
@@ -28486,10 +28888,20 @@
             <w:r>
               <w:rPr>
                 <w:rFonts w:ascii="Times New Roman" w:cs="Times New Roman" w:eastAsia="Times New Roman" w:hAnsi="Times New Roman"/>
-                <w:sz w:val="20"/>
-                <w:szCs w:val="20"/>
-              </w:rPr>
-              <w:t xml:space="preserve">Social listening (3 meses)</w:t>
+                <w:i w:val="1"/>
+                <w:iCs w:val="1"/>
+                <w:sz w:val="20"/>
+                <w:szCs w:val="20"/>
+              </w:rPr>
+              <w:t xml:space="preserve">Social listening</w:t>
+            </w:r>
+            <w:r>
+              <w:rPr>
+                <w:rFonts w:ascii="Times New Roman" w:cs="Times New Roman" w:eastAsia="Times New Roman" w:hAnsi="Times New Roman"/>
+                <w:sz w:val="20"/>
+                <w:szCs w:val="20"/>
+              </w:rPr>
+              <w:t xml:space="preserve"> (3 meses)</w:t>
             </w:r>
           </w:p>
         </w:tc>
@@ -28725,7 +29137,25 @@
                 <w:sz w:val="20"/>
                 <w:szCs w:val="20"/>
               </w:rPr>
-              <w:t xml:space="preserve">Painel (dashboard), análise e relatório final</w:t>
+              <w:t xml:space="preserve">Painel (</w:t>
+            </w:r>
+            <w:r>
+              <w:rPr>
+                <w:rFonts w:ascii="Times New Roman" w:cs="Times New Roman" w:eastAsia="Times New Roman" w:hAnsi="Times New Roman"/>
+                <w:i w:val="1"/>
+                <w:iCs w:val="1"/>
+                <w:sz w:val="20"/>
+                <w:szCs w:val="20"/>
+              </w:rPr>
+              <w:t xml:space="preserve">dashboard</w:t>
+            </w:r>
+            <w:r>
+              <w:rPr>
+                <w:rFonts w:ascii="Times New Roman" w:cs="Times New Roman" w:eastAsia="Times New Roman" w:hAnsi="Times New Roman"/>
+                <w:sz w:val="20"/>
+                <w:szCs w:val="20"/>
+              </w:rPr>
+              <w:t xml:space="preserve">), análise e relatório final</w:t>
             </w:r>
           </w:p>
         </w:tc>
@@ -31272,7 +31702,17 @@
                 <w:sz w:val="18"/>
                 <w:szCs w:val="18"/>
               </w:rPr>
-              <w:t xml:space="preserve">Alta: brand lift</w:t>
+              <w:t xml:space="preserve">Alta: </w:t>
+            </w:r>
+            <w:r>
+              <w:rPr>
+                <w:rFonts w:ascii="Times New Roman" w:cs="Times New Roman" w:eastAsia="Times New Roman" w:hAnsi="Times New Roman"/>
+                <w:i w:val="1"/>
+                <w:iCs w:val="1"/>
+                <w:sz w:val="18"/>
+                <w:szCs w:val="18"/>
+              </w:rPr>
+              <w:t xml:space="preserve">brand lift</w:t>
             </w:r>
           </w:p>
         </w:tc>
@@ -32091,7 +32531,7 @@
                 <w:sz w:val="18"/>
                 <w:szCs w:val="18"/>
               </w:rPr>
-              <w:t xml:space="preserve">Prioridade 2: restrita a 5 praças e 3 semanas</w:t>
+              <w:t xml:space="preserve">Prioridade 2: restrita a 5 cidades e 3 semanas</w:t>
             </w:r>
           </w:p>
         </w:tc>
@@ -32577,7 +33017,25 @@
                 <w:sz w:val="18"/>
                 <w:szCs w:val="18"/>
               </w:rPr>
-              <w:t xml:space="preserve">Média: listening e participação</w:t>
+              <w:t xml:space="preserve">Média: </w:t>
+            </w:r>
+            <w:r>
+              <w:rPr>
+                <w:rFonts w:ascii="Times New Roman" w:cs="Times New Roman" w:eastAsia="Times New Roman" w:hAnsi="Times New Roman"/>
+                <w:i w:val="1"/>
+                <w:iCs w:val="1"/>
+                <w:sz w:val="18"/>
+                <w:szCs w:val="18"/>
+              </w:rPr>
+              <w:t xml:space="preserve">social listening</w:t>
+            </w:r>
+            <w:r>
+              <w:rPr>
+                <w:rFonts w:ascii="Times New Roman" w:cs="Times New Roman" w:eastAsia="Times New Roman" w:hAnsi="Times New Roman"/>
+                <w:sz w:val="18"/>
+                <w:szCs w:val="18"/>
+              </w:rPr>
+              <w:t xml:space="preserve"> e participação</w:t>
             </w:r>
           </w:p>
         </w:tc>
@@ -32930,7 +33388,7 @@
           <w:sz w:val="24"/>
           <w:szCs w:val="24"/>
         </w:rPr>
-        <w:t xml:space="preserve"> a maior fatia vai para A1 porque o objetivo é mudar uma percepção; sem a nova associação, as demais ações perdem efeito. A mídia (42,7%) supera a produção porque o plano reaproveita ativos existentes e precisa chegar a um público grande: somando universitários e trabalhadores remotos, são cerca de 20 milhões de pessoas, sem descontar a sobreposição entre os grupos (complemento A). A mensuração recebe 10,1%, fatia que o grupo considera acima da usual em campanhas de manutenção, porque este é um piloto: quando o recurso é limitado, deve-se priorizar o que mais reduz incerteza ou aumenta a aprendizagem (SOUZA, 2026c).</w:t>
+        <w:t xml:space="preserve"> a maior fatia vai para A1, pois o objetivo do plano é mudar uma percepção e, sem a nova associação, as demais ações perdem efeito. A mídia (42,7%) supera a produção porque o plano reaproveita recursos já existentes da marca e precisa chegar a um público grande. Somando universitários e trabalhadores remotos, são cerca de 20 milhões de pessoas, sem descontar a sobreposição entre os dois grupos (complemento A). Já a mensuração recebe 10,1%, fatia que consideramos acima do comum em campanhas de manutenção. Optamos por esse valor porque este é um piloto e, quando o recurso é limitado, deve-se priorizar o que mais reduz a incerteza ou aumenta a aprendizagem (SOUZA, 2026c).</w:t>
       </w:r>
     </w:p>
     <w:p>
@@ -32948,7 +33406,7 @@
           <w:sz w:val="24"/>
           <w:szCs w:val="24"/>
         </w:rPr>
-        <w:t xml:space="preserve">Os cupons ficam limitados a 4,8% do total por uma razão de posicionamento. A Red Bull pratica preço premium e é a terceira marca em volume no canal moderno brasileiro, atrás de Monster e Baly (NIELSENIQ apud GIRONEWS, 2025). Disputar preço enfraqueceria o posicionamento; por isso, o plano vende ocasião e significado.</w:t>
+        <w:t xml:space="preserve">Limitamos os cupons a 4,8% do total por uma questão de posicionamento. A Red Bull pratica preço premium e é a terceira marca em volume no canal moderno brasileiro, atrás de Monster e Baly (NIELSENIQ apud GIRONEWS, 2025). Entrar em uma disputa de preço enfraqueceria esse posicionamento. Por isso, o plano vende a ocasião de consumo e o significado da marca.</w:t>
       </w:r>
     </w:p>
     <w:p>
@@ -33002,7 +33460,7 @@
           <w:sz w:val="24"/>
           <w:szCs w:val="24"/>
         </w:rPr>
-        <w:t xml:space="preserve">O painel tem seis indicadores, cada um ligado a uma etapa da jornada e ao objetivo de comunicação. Os KPIs de cada ação (Quadro 10) são acompanhados pelos responsáveis como métricas de diagnóstico e só sobem ao painel quando explicam um desvio. Curtidas, seguidores e impressões isoladas ficam de fora porque não mudam nenhuma decisão (SOUZA, 2026c).</w:t>
+        <w:t xml:space="preserve">Definimos um painel com seis indicadores, e cada um deles está ligado a uma etapa da jornada e ao objetivo de comunicação. Os KPIs de cada ação (Quadro 10) são acompanhados pelos responsáveis como métricas de diagnóstico e só entram no painel quando ajudam a explicar algum desvio. Curtidas, seguidores e impressões isoladas ficaram de fora, pois não mudam nenhuma decisão (SOUZA, 2026c).</w:t>
       </w:r>
     </w:p>
     <w:p>
@@ -33030,7 +33488,7 @@
           <w:sz w:val="24"/>
           <w:szCs w:val="24"/>
         </w:rPr>
-        <w:t xml:space="preserve"> o grupo não tem acesso aos dados internos da Red Bull. Por isso, as linhas de base do painel são valores fictícios para fins acadêmicos e estão marcadas como tal. Na execução real, seriam substituídas pela pesquisa de linha de base (S2 e S3) e pelo histórico da empresa e dos parceiros. As metas são estimativas do grupo.</w:t>
+        <w:t xml:space="preserve"> como não temos acesso aos dados internos da Red Bull, as linhas de base do painel são valores fictícios para fins acadêmicos e estão identificadas dessa forma. Em uma execução real, esses valores seriam substituídos pelos resultados da pesquisa de linha de base (S2 e S3) e pelo histórico da empresa e dos parceiros. Já as metas são estimativas do grupo.</w:t>
       </w:r>
     </w:p>
     <w:p>
@@ -33672,7 +34130,7 @@
                 <w:sz w:val="18"/>
                 <w:szCs w:val="18"/>
               </w:rPr>
-              <w:t xml:space="preserve">Estagna (alcance sobe, mas o indicador 3 não): o problema é a mensagem, não a verba; trocar criativos antes de investir mais.</w:t>
+              <w:t xml:space="preserve">Estagna (alcance sobe, mas o indicador 3 não): o problema está na mensagem e não na verba; trocar criativos antes de investir mais.</w:t>
             </w:r>
           </w:p>
         </w:tc>
@@ -33753,7 +34211,7 @@
                 <w:sz w:val="18"/>
                 <w:szCs w:val="18"/>
               </w:rPr>
-              <w:t xml:space="preserve">Mostra se a história é assistida o bastante para transmitir a mensagem</w:t>
+              <w:t xml:space="preserve">Mostra se a história é assistida por tempo suficiente para passar a mensagem</w:t>
             </w:r>
           </w:p>
         </w:tc>
@@ -34122,7 +34580,7 @@
                 <w:sz w:val="18"/>
                 <w:szCs w:val="18"/>
               </w:rPr>
-              <w:t xml:space="preserve">30% (+8 p.p.), com lift significativo entre expostos e não expostos; associação com “superar limites” sem queda maior que 2 p.p. (estimativa do grupo)</w:t>
+              <w:t xml:space="preserve">30% (+8 p.p.), com aumento significativo nos expostos em relação aos não expostos; associação com “superar limites” sem queda maior que 2 p.p. (estimativa do grupo)</w:t>
             </w:r>
           </w:p>
         </w:tc>
@@ -34158,7 +34616,25 @@
                 <w:sz w:val="18"/>
                 <w:szCs w:val="18"/>
               </w:rPr>
-              <w:t xml:space="preserve">Pesquisa pré e pós com instituto; brand lift das plataformas</w:t>
+              <w:t xml:space="preserve">Pesquisa pré e pós com instituto; </w:t>
+            </w:r>
+            <w:r>
+              <w:rPr>
+                <w:rFonts w:ascii="Times New Roman" w:cs="Times New Roman" w:eastAsia="Times New Roman" w:hAnsi="Times New Roman"/>
+                <w:i w:val="1"/>
+                <w:iCs w:val="1"/>
+                <w:sz w:val="18"/>
+                <w:szCs w:val="18"/>
+              </w:rPr>
+              <w:t xml:space="preserve">brand lift</w:t>
+            </w:r>
+            <w:r>
+              <w:rPr>
+                <w:rFonts w:ascii="Times New Roman" w:cs="Times New Roman" w:eastAsia="Times New Roman" w:hAnsi="Times New Roman"/>
+                <w:sz w:val="18"/>
+                <w:szCs w:val="18"/>
+              </w:rPr>
+              <w:t xml:space="preserve"> das plataformas</w:t>
             </w:r>
           </w:p>
         </w:tc>
@@ -34455,7 +34931,17 @@
                 <w:sz w:val="18"/>
                 <w:szCs w:val="18"/>
               </w:rPr>
-              <w:t xml:space="preserve">Pesquisa pré e pós; brand lift</w:t>
+              <w:t xml:space="preserve">Pesquisa pré e pós; </w:t>
+            </w:r>
+            <w:r>
+              <w:rPr>
+                <w:rFonts w:ascii="Times New Roman" w:cs="Times New Roman" w:eastAsia="Times New Roman" w:hAnsi="Times New Roman"/>
+                <w:i w:val="1"/>
+                <w:iCs w:val="1"/>
+                <w:sz w:val="18"/>
+                <w:szCs w:val="18"/>
+              </w:rPr>
+              <w:t xml:space="preserve">brand lift</w:t>
             </w:r>
           </w:p>
         </w:tc>
@@ -34842,7 +35328,7 @@
                 <w:sz w:val="18"/>
                 <w:szCs w:val="18"/>
               </w:rPr>
-              <w:t xml:space="preserve">Cai: auditar a execução (material instalado? falta de produto?).</w:t>
+              <w:t xml:space="preserve">Cai: verificar a execução (material instalado? falta de produto?).</w:t>
             </w:r>
           </w:p>
           <w:p>
@@ -35215,7 +35701,7 @@
           <w:sz w:val="24"/>
           <w:szCs w:val="24"/>
         </w:rPr>
-        <w:t xml:space="preserve"> métricas de vaidade (curtidas, seguidores) não entram no plano. Métricas de diagnóstico (os KPIs de cada ação) explicam por que um resultado aconteceu. Métricas de decisão (os seis indicadores do painel) dizem se cada ação deve ser mantida, ajustada, escalada ou encerrada (SOUZA, 2026c).</w:t>
+        <w:t xml:space="preserve"> optamos por deixar de fora do plano as métricas de vaidade, como curtidas e seguidores. As métricas de diagnóstico, que são os KPIs de cada ação, servem para explicar por que um resultado aconteceu. Já as métricas de decisão, que são os seis indicadores do painel, mostram se cada ação deve ser mantida, ajustada, escalada ou encerrada (SOUZA, 2026c).</w:t>
       </w:r>
     </w:p>
     <w:p>
@@ -35269,7 +35755,7 @@
           <w:sz w:val="24"/>
           <w:szCs w:val="24"/>
         </w:rPr>
-        <w:t xml:space="preserve">A avaliação fecha o ciclo Planejar, Executar, Medir e Aprender. O relatório final não é só prestação de contas: é a memória estratégica que orienta a próxima rodada de comunicação (SOUZA, 2026c).</w:t>
+        <w:t xml:space="preserve">A avaliação fecha o ciclo Planejar, Executar, Medir e Aprender. Além de servir como prestação de contas, o relatório final funciona como a memória estratégica do plano, pois é ele que orienta a próxima rodada de comunicação (SOUZA, 2026c).</w:t>
       </w:r>
     </w:p>
     <w:p>
@@ -35571,7 +36057,7 @@
                 <w:sz w:val="20"/>
                 <w:szCs w:val="20"/>
               </w:rPr>
-              <w:t xml:space="preserve">Partes 1 e 2, complementos e pesquisa de linha de base para confirmar o insight e fixar as linhas de base</w:t>
+              <w:t xml:space="preserve">Partes 1 e 2, complementos e pesquisa de linha de base para confirmar o insight e definir as linhas de base</w:t>
             </w:r>
           </w:p>
         </w:tc>
@@ -36554,7 +37040,7 @@
                 <w:sz w:val="20"/>
                 <w:szCs w:val="20"/>
               </w:rPr>
-              <w:t xml:space="preserve">Muda criativo, segmentação, oferta ou praça, sem aumentar a verba</w:t>
+              <w:t xml:space="preserve">Muda criativo, segmentação, oferta ou cidade, sem aumentar a verba</w:t>
             </w:r>
           </w:p>
         </w:tc>
@@ -36674,7 +37160,7 @@
                 <w:sz w:val="20"/>
                 <w:szCs w:val="20"/>
               </w:rPr>
-              <w:t xml:space="preserve">Recebe a reserva de mídia e é levada a novas praças ou públicos</w:t>
+              <w:t xml:space="preserve">Recebe a reserva de mídia e é levada a novas cidades ou públicos</w:t>
             </w:r>
           </w:p>
         </w:tc>
@@ -36868,7 +37354,7 @@
           <w:sz w:val="24"/>
           <w:szCs w:val="24"/>
         </w:rPr>
-        <w:t xml:space="preserve"> o insight se confirma. A próxima rodada amplia praças e período, por exemplo para um semestre letivo completo.</w:t>
+        <w:t xml:space="preserve"> nesse caso, o insight se confirma, e a próxima rodada leva a campanha a mais cidades e estende o seu período, por exemplo para um semestre letivo completo.</w:t>
       </w:r>
     </w:p>
     <w:p>
@@ -36901,7 +37387,7 @@
           <w:sz w:val="24"/>
           <w:szCs w:val="24"/>
         </w:rPr>
-        <w:t xml:space="preserve"> a barreira está na compra. A próxima rodada concentra verba no PDV e nos aplicativos (A5 e A6) e revisa preço e disponibilidade.</w:t>
+        <w:t xml:space="preserve"> isso mostra que a barreira está na compra. Por isso, a próxima rodada concentra a verba no PDV e nos aplicativos (A5 e A6) e revisa o preço e a disponibilidade.</w:t>
       </w:r>
     </w:p>
     <w:p>
@@ -36934,7 +37420,7 @@
           <w:sz w:val="24"/>
           <w:szCs w:val="24"/>
         </w:rPr>
-        <w:t xml:space="preserve"> o insight não se confirmou. O grupo volta ao diagnóstico (Parte 1), com pesquisa qualitativa junto ao público, antes de investir de novo.</w:t>
+        <w:t xml:space="preserve"> isso significa que o insight não se confirmou. Assim, voltamos ao diagnóstico (Parte 1) e fazemos uma pesquisa qualitativa com o público antes de investir de novo.</w:t>
       </w:r>
     </w:p>
     <w:p>
@@ -36967,7 +37453,7 @@
           <w:sz w:val="24"/>
           <w:szCs w:val="24"/>
         </w:rPr>
-        <w:t xml:space="preserve"> a narrativa é reequilibrada, aproximando as conquistas diárias dos códigos de performance da marca.</w:t>
+        <w:t xml:space="preserve"> a narrativa deve ser reequilibrada, aproximando as conquistas diárias dos códigos de performance da marca.</w:t>
       </w:r>
     </w:p>
     <w:p>
@@ -37000,7 +37486,7 @@
           <w:sz w:val="24"/>
           <w:szCs w:val="24"/>
         </w:rPr>
-        <w:t xml:space="preserve"> os dados próprios da campanha substituem hipóteses na seção de Evidências e Hipóteses da Parte 1.</w:t>
+        <w:t xml:space="preserve"> os dados obtidos pela própria campanha passam a substituir hipóteses na seção de Evidências e Hipóteses da Parte 1.</w:t>
       </w:r>
     </w:p>
     <w:p>
@@ -37290,7 +37776,7 @@
                 <w:sz w:val="20"/>
                 <w:szCs w:val="20"/>
               </w:rPr>
-              <w:t xml:space="preserve">Se o PDV converte sem desconto, a hipótese se fortalece. Se só o cupom converte, o preço pesa mais que o significado.</w:t>
+              <w:t xml:space="preserve">Se o PDV converte sem desconto, a hipótese se fortalece. Se só o cupom converte, o preço pesa mais que o significado da marca.</w:t>
             </w:r>
           </w:p>
         </w:tc>
@@ -37369,7 +37855,7 @@
                 <w:sz w:val="20"/>
                 <w:szCs w:val="20"/>
               </w:rPr>
-              <w:t xml:space="preserve">Mede a parcela do alcance de A1 e A3 que vem de conteúdo de usuários, compartilhamentos e imprensa, em relação ao alcance pago.</w:t>
+              <w:t xml:space="preserve">Mede a parcela do alcance de A1 e A3 que vem de conteúdo feito pelos usuários, compartilhamentos e imprensa, em relação ao alcance pago.</w:t>
             </w:r>
           </w:p>
         </w:tc>
@@ -37877,7 +38363,7 @@
                 <w:sz w:val="20"/>
                 <w:szCs w:val="20"/>
               </w:rPr>
-              <w:t xml:space="preserve">Universitários, trabalhadores remotos e profissionais do conhecimento de 18 a 35 anos (Parte 2), dimensionados no complemento A. A seção 4 descreve o público amplo (18 a 45 anos); o prioritário é o recorte de 18 a 35 anos.</w:t>
+              <w:t xml:space="preserve">Universitários, trabalhadores remotos e profissionais do conhecimento de 18 a 35 anos (Parte 2), com tamanho estimado no complemento A. A seção 4 descreve o público amplo (18 a 45 anos); o prioritário é o recorte de 18 a 35 anos.</w:t>
             </w:r>
           </w:p>
         </w:tc>
@@ -37990,7 +38476,7 @@
                 <w:sz w:val="20"/>
                 <w:szCs w:val="20"/>
               </w:rPr>
-              <w:t xml:space="preserve">Complemento B (fórmula com horizonte de três meses) e indicadores 3 e 4 do painel, com linha de base e meta.</w:t>
+              <w:t xml:space="preserve">Complemento B (fórmula com prazo de três meses) e indicadores 3 e 4 do painel, com linha de base e meta.</w:t>
             </w:r>
           </w:p>
         </w:tc>
@@ -38633,7 +39119,7 @@
           <w:sz w:val="24"/>
           <w:szCs w:val="24"/>
         </w:rPr>
-        <w:t xml:space="preserve">Nenhuma ação aparece sem justificativa na etapa anterior: cada linha parte de uma faceta do problema de comunicação e chega a um indicador do painel (SOUZA, 2026a).</w:t>
+        <w:t xml:space="preserve">Com a tabela de rastreabilidade, buscamos mostrar que nenhuma ação aparece sem justificativa na etapa anterior, uma vez que cada linha parte de uma faceta do problema de comunicação e chega a um indicador do painel (SOUZA, 2026a).</w:t>
       </w:r>
     </w:p>
     <w:p>
@@ -39420,7 +39906,35 @@
                 <w:sz w:val="18"/>
                 <w:szCs w:val="18"/>
               </w:rPr>
-              <w:t xml:space="preserve">Hub no site, playlist e remarketing</w:t>
+              <w:t xml:space="preserve">Hub no site, </w:t>
+            </w:r>
+            <w:r>
+              <w:rPr>
+                <w:rFonts w:ascii="Times New Roman" w:cs="Times New Roman" w:eastAsia="Times New Roman" w:hAnsi="Times New Roman"/>
+                <w:i w:val="1"/>
+                <w:iCs w:val="1"/>
+                <w:sz w:val="18"/>
+                <w:szCs w:val="18"/>
+              </w:rPr>
+              <w:t xml:space="preserve">playlist</w:t>
+            </w:r>
+            <w:r>
+              <w:rPr>
+                <w:rFonts w:ascii="Times New Roman" w:cs="Times New Roman" w:eastAsia="Times New Roman" w:hAnsi="Times New Roman"/>
+                <w:sz w:val="18"/>
+                <w:szCs w:val="18"/>
+              </w:rPr>
+              <w:t xml:space="preserve"> e </w:t>
+            </w:r>
+            <w:r>
+              <w:rPr>
+                <w:rFonts w:ascii="Times New Roman" w:cs="Times New Roman" w:eastAsia="Times New Roman" w:hAnsi="Times New Roman"/>
+                <w:i w:val="1"/>
+                <w:iCs w:val="1"/>
+                <w:sz w:val="18"/>
+                <w:szCs w:val="18"/>
+              </w:rPr>
+              <w:t xml:space="preserve">remarketing</w:t>
             </w:r>
           </w:p>
         </w:tc>
@@ -39605,7 +40119,7 @@
                 <w:sz w:val="18"/>
                 <w:szCs w:val="18"/>
               </w:rPr>
-              <w:t xml:space="preserve">Dar credibilidade à marca no novo território</w:t>
+              <w:t xml:space="preserve">Dar credibilidade à marca no novo posicionamento</w:t>
             </w:r>
           </w:p>
         </w:tc>
@@ -39677,7 +40191,25 @@
                 <w:sz w:val="18"/>
                 <w:szCs w:val="18"/>
               </w:rPr>
-              <w:t xml:space="preserve">Conteúdo de usuários, stories e imprensa</w:t>
+              <w:t xml:space="preserve">Conteúdo feito pelos usuários, </w:t>
+            </w:r>
+            <w:r>
+              <w:rPr>
+                <w:rFonts w:ascii="Times New Roman" w:cs="Times New Roman" w:eastAsia="Times New Roman" w:hAnsi="Times New Roman"/>
+                <w:i w:val="1"/>
+                <w:iCs w:val="1"/>
+                <w:sz w:val="18"/>
+                <w:szCs w:val="18"/>
+              </w:rPr>
+              <w:t xml:space="preserve">stories</w:t>
+            </w:r>
+            <w:r>
+              <w:rPr>
+                <w:rFonts w:ascii="Times New Roman" w:cs="Times New Roman" w:eastAsia="Times New Roman" w:hAnsi="Times New Roman"/>
+                <w:sz w:val="18"/>
+                <w:szCs w:val="18"/>
+              </w:rPr>
+              <w:t xml:space="preserve"> e imprensa</w:t>
             </w:r>
           </w:p>
         </w:tc>
@@ -39826,7 +40358,25 @@
                 <w:sz w:val="18"/>
                 <w:szCs w:val="18"/>
               </w:rPr>
-              <w:t xml:space="preserve">Universitários e usuários de coworkings em semanas de provas</w:t>
+              <w:t xml:space="preserve">Universitários e usuários de </w:t>
+            </w:r>
+            <w:r>
+              <w:rPr>
+                <w:rFonts w:ascii="Times New Roman" w:cs="Times New Roman" w:eastAsia="Times New Roman" w:hAnsi="Times New Roman"/>
+                <w:i w:val="1"/>
+                <w:iCs w:val="1"/>
+                <w:sz w:val="18"/>
+                <w:szCs w:val="18"/>
+              </w:rPr>
+              <w:t xml:space="preserve">coworkings</w:t>
+            </w:r>
+            <w:r>
+              <w:rPr>
+                <w:rFonts w:ascii="Times New Roman" w:cs="Times New Roman" w:eastAsia="Times New Roman" w:hAnsi="Times New Roman"/>
+                <w:sz w:val="18"/>
+                <w:szCs w:val="18"/>
+              </w:rPr>
+              <w:t xml:space="preserve"> em semanas de provas</w:t>
             </w:r>
           </w:p>
         </w:tc>
@@ -40083,7 +40633,17 @@
                 <w:sz w:val="18"/>
                 <w:szCs w:val="18"/>
               </w:rPr>
-              <w:t xml:space="preserve">Público quente na rota do campus e do coworking</w:t>
+              <w:t xml:space="preserve">Público quente na rota do campus e do </w:t>
+            </w:r>
+            <w:r>
+              <w:rPr>
+                <w:rFonts w:ascii="Times New Roman" w:cs="Times New Roman" w:eastAsia="Times New Roman" w:hAnsi="Times New Roman"/>
+                <w:i w:val="1"/>
+                <w:iCs w:val="1"/>
+                <w:sz w:val="18"/>
+                <w:szCs w:val="18"/>
+              </w:rPr>
+              <w:t xml:space="preserve">coworking</w:t>
             </w:r>
           </w:p>
         </w:tc>
@@ -40833,7 +41393,7 @@
           <w:sz w:val="24"/>
           <w:szCs w:val="24"/>
         </w:rPr>
-        <w:t xml:space="preserve"> todas as facetas derivam do problema da seção 3; todos os públicos são recortes do público prioritário da Parte 2; todos os objetivos desdobram o objetivo de comunicação (complemento B); todas as mensagens desdobram a mensagem central; e cada um dos seis indicadores do painel é alimentado por pelo menos uma ação.</w:t>
+        <w:t xml:space="preserve"> lendo a tabela por colunas, é possível ver que todas as facetas vêm do problema apresentado na seção 3 e que todos os públicos são recortes do público prioritário da Parte 2. Da mesma forma, todos os objetivos são desdobramentos do objetivo de comunicação (complemento B), e todas as mensagens são desdobramentos da mensagem central. Além disso, cada um dos seis indicadores do painel é alimentado por pelo menos uma ação.</w:t>
       </w:r>
     </w:p>
     <w:p>

</xml_diff>

<commit_message>
Restaura as Partes 1 e 2 exatamente como o grupo escreveu
Desfaz as duas mudanças de formatação que atingiam as Partes 1 e 2: o
negrito no título da seção 1 e a troca da fonte padrão e do idioma em
styles.xml. O XML das Partes 1 e 2 e todos os demais arquivos internos
do original voltam a ser idênticos byte a byte; a parte nova continua em
Times New Roman 12 e cor automática.

Co-Authored-By: Claude Opus 5.5 <noreply@anthropic.com>
Claude-Session: https://claude.ai/code/session_01BVfLaRRKzm2R3n6NVVxmAf
</commit_message>
<xml_diff>
--- a/entregas/Red_Bull_Plano_CIM_Partes_1_a_3.docx
+++ b/entregas/Red_Bull_Plano_CIM_Partes_1_a_3.docx
@@ -1313,8 +1313,6 @@
       <w:r>
         <w:rPr>
           <w:rFonts w:ascii="Times New Roman" w:cs="Times New Roman" w:eastAsia="Times New Roman" w:hAnsi="Times New Roman"/>
-          <w:b w:val="1"/>
-          <w:bCs w:val="1"/>
           <w:sz w:val="24"/>
           <w:szCs w:val="24"/>
           <w:rtl w:val="0"/>
@@ -42407,10 +42405,10 @@
   <w:docDefaults>
     <w:rPrDefault>
       <w:rPr>
-        <w:rFonts w:ascii="Times New Roman" w:cs="Times New Roman" w:eastAsia="Times New Roman" w:hAnsi="Times New Roman"/>
-        <w:sz w:val="24"/>
-        <w:szCs w:val="24"/>
-        <w:lang w:val="pt-BR"/>
+        <w:rFonts w:ascii="Arial" w:cs="Arial" w:eastAsia="Arial" w:hAnsi="Arial"/>
+        <w:sz w:val="22"/>
+        <w:szCs w:val="22"/>
+        <w:lang w:val="pt_BR"/>
       </w:rPr>
     </w:rPrDefault>
     <w:pPrDefault>

</xml_diff>